<commit_message>
manuscript and appendix checked ant good! (v7) !!!
</commit_message>
<xml_diff>
--- a/paper/SIR/manuscript-v7.docx
+++ b/paper/SIR/manuscript-v7.docx
@@ -452,7 +452,10 @@
         <w:t xml:space="preserve">(Kalayaan, 2008; Mantouvalou, 2016; Service, 2023; Yilmaz &amp; Emberson, 2023)</w:t>
       </w:r>
       <w:r>
-        <w:t xml:space="preserve">, not a mapping the ILO itself publishes. The remaining two ILO indicators – abuse of vulnerability and deception – are not measured as standalone binary prevalence indicators: both are too retrospective and judgemental to elicit reliably through a brief survey of n=85 respondents (the respondent would need to reconstruct intent and knowledge states from the perspective of months or years after the fact). Both are nonetheless included in the composite risk index (</w:t>
+        <w:t xml:space="preserve">, not a mapping the ILO itself publishes. The remaining two ILO indicators – abuse of vulnerability and deception – are not measured as standalone binary prevalence indicators: both are too retrospective and judgemental to elicit reliably through a brief survey of n=85 respondents (the respondent would need to reconstruct intent and knowledge states from the perspective of months or years after the fact). Both are nonetheless included in the composite risk index (Appendix Table A.1, Categories 1 and 2; results in</w:t>
+      </w:r>
+      <w:r>
+        <w:t xml:space="preserve"> </w:t>
       </w:r>
       <w:hyperlink w:anchor="sec-composite-results">
         <w:r>
@@ -463,7 +466,7 @@
         </w:r>
       </w:hyperlink>
       <w:r>
-        <w:t xml:space="preserve">; Appendix Table A.1, Categories 1 and 2). Where appropriate we note this scope limitation in the discussion of results.</w:t>
+        <w:t xml:space="preserve">). Where appropriate we note this scope limitation in the discussion of results.</w:t>
       </w:r>
     </w:p>
     <w:p>
@@ -482,6 +485,9 @@
         </w:r>
       </w:hyperlink>
       <w:r>
+        <w:t xml:space="preserve">,</w:t>
+      </w:r>
+      <w:r>
         <w:t xml:space="preserve"> </w:t>
       </w:r>
       <w:hyperlink w:anchor="tbl-indicator-mapping">
@@ -551,7 +557,7 @@
     </w:p>
     <w:bookmarkEnd w:id="21"/>
     <w:bookmarkEnd w:id="22"/>
-    <w:bookmarkStart w:id="38" w:name="sec-case-setting"/>
+    <w:bookmarkStart w:id="39" w:name="sec-case-setting"/>
     <w:p>
       <w:pPr>
         <w:pStyle w:val="Heading1"/>
@@ -2059,7 +2065,7 @@
       </w:r>
     </w:p>
     <w:bookmarkEnd w:id="25"/>
-    <w:bookmarkStart w:id="31" w:name="sec-sample-characteristics"/>
+    <w:bookmarkStart w:id="32" w:name="sec-sample-characteristics"/>
     <w:p>
       <w:pPr>
         <w:pStyle w:val="Heading2"/>
@@ -2138,30 +2144,60 @@
         <w:pStyle w:val="BodyText"/>
       </w:pPr>
       <w:r>
-        <w:t xml:space="preserve">Of the 97 initial respondents, 90 identified themselves as transnational migrants. Forty-five percent regarded themselves as self-employed, 39% identified themselves as employees, and 16% categorised</w:t>
-      </w:r>
-      <w:r>
-        <w:t xml:space="preserve"> </w:t>
-      </w:r>
-      <w:r>
-        <w:t xml:space="preserve">their employment status as that of a worker. The largest single nationality group, comprising 64 respondents (66% of the total), reported a Filipina background. Other nationalities represented</w:t>
-      </w:r>
-      <w:r>
-        <w:t xml:space="preserve"> </w:t>
-      </w:r>
-      <w:r>
-        <w:t xml:space="preserve">included Dominican, Brazilian, Spanish, Colombian, Bolivian, Venezuelan, Cuban, and Panamanian. Female domestic workers made up 97% of the sample, with 3% of the sample comprised of male domestic</w:t>
-      </w:r>
-      <w:r>
-        <w:t xml:space="preserve"> </w:t>
-      </w:r>
-      <w:r>
-        <w:t xml:space="preserve">workers. The age structure of the domestic workers was skewed towards those over 45 years old, with such workers representing over half of the sample (see</w:t>
+        <w:t xml:space="preserve">Of the 97 initial respondents, 90 identified themselves as transnational migrants. In the analytical sample of</w:t>
+      </w:r>
+      <w:r>
+        <w:t xml:space="preserve"> </w:t>
+      </w:r>
+      <m:oMath>
+        <m:r>
+          <m:t>n</m:t>
+        </m:r>
+        <m:r>
+          <m:rPr>
+            <m:sty m:val="p"/>
+          </m:rPr>
+          <m:t>=</m:t>
+        </m:r>
+        <m:r>
+          <m:t>85</m:t>
+        </m:r>
+      </m:oMath>
+      <w:r>
+        <w:t xml:space="preserve"> </w:t>
+      </w:r>
+      <w:r>
+        <w:t xml:space="preserve">(</w:t>
+      </w:r>
+      <w:hyperlink w:anchor="tbl-demographics">
+        <w:r>
+          <w:rPr>
+            <w:rStyle w:val="Hyperlink"/>
+          </w:rPr>
+          <w:t xml:space="preserve">Table 2</w:t>
+        </w:r>
+      </w:hyperlink>
+      <w:r>
+        <w:t xml:space="preserve">), 47% regarded themselves as self-employed, 37% identified themselves as employees, and 17% categorised their employment status as agency workers. Filipino respondents constitute the largest nationality cluster (65 respondents, 76% of the analytical sample;</w:t>
       </w:r>
       <w:r>
         <w:t xml:space="preserve"> </w:t>
       </w:r>
       <w:hyperlink w:anchor="tbl-sample-chars">
+        <w:r>
+          <w:rPr>
+            <w:rStyle w:val="Hyperlink"/>
+          </w:rPr>
+          <w:t xml:space="preserve">Table 3</w:t>
+        </w:r>
+      </w:hyperlink>
+      <w:r>
+        <w:t xml:space="preserve"> </w:t>
+      </w:r>
+      <w:r>
+        <w:t xml:space="preserve">for the full nationality × wave breakdown); other nationalities represented include Dominican, Brazilian, Spanish, Colombian, Bolivian, Venezuelan, Cuban, and Panamanian. Female domestic workers made up 98% of the analytical sample, with the remaining 2% male. The age structure is skewed towards older workers: 49% of respondents are aged 45+, and a further 26% are aged 35–40 (</w:t>
+      </w:r>
+      <w:hyperlink w:anchor="tbl-demographics">
         <w:r>
           <w:rPr>
             <w:rStyle w:val="Hyperlink"/>
@@ -2273,7 +2309,7 @@
       <w:tr>
         <w:tc>
           <w:tcPr/>
-          <w:bookmarkStart w:id="30" w:name="tbl-sample-chars"/>
+          <w:bookmarkStart w:id="30" w:name="tbl-demographics"/>
           <w:p>
             <w:pPr>
               <w:jc w:val="center"/>
@@ -2284,34 +2320,39 @@
               <w:pStyle w:val="ImageCaption"/>
             </w:pPr>
             <w:r>
-              <w:t xml:space="preserve">Table 2: Sample composition by nationality cluster and recruitment wave (n = 85). Wave 0 indicates seed respondents; subsequent waves are respondent-driven recruits. Filipino respondents dominate the sample (76%) and contribute the deepest recruitment chains; other nationality clusters are smaller and shallower. Source: Authors’ own work.</w:t>
+              <w:t xml:space="preserve">Table 2: Sample demographics (n = 85 analytical sample). Response categories for age and length of time in the UK follow the survey codebook (Appendix A.3); the codebook’s original response options include a small ordinal gap between 40 and 45 years of age. Source: Authors’ construction from</w:t>
+            </w:r>
+            <w:r>
+              <w:t xml:space="preserve"> </w:t>
+            </w:r>
+            <w:r>
+              <w:rPr>
+                <w:rStyle w:val="VerbatimChar"/>
+              </w:rPr>
+              <w:t xml:space="preserve">data/processed/prepared_data.csv</w:t>
+            </w:r>
+            <w:r>
+              <w:t xml:space="preserve">.</w:t>
             </w:r>
           </w:p>
           <w:tbl>
             <w:tblPr>
               <w:tblStyle w:val="Table"/>
-              <w:tblW w:type="pct" w:w="4167"/>
-              <w:tblLayout w:type="fixed"/>
+              <w:tblW w:type="auto" w:w="0"/>
               <w:tblLook w:firstRow="1" w:lastRow="0" w:firstColumn="0" w:lastColumn="0" w:noHBand="0" w:noVBand="0" w:val="0020"/>
             </w:tblPr>
             <w:tblGrid>
-              <w:gridCol w:w="2090"/>
-              <w:gridCol w:w="880"/>
-              <w:gridCol w:w="880"/>
-              <w:gridCol w:w="330"/>
-              <w:gridCol w:w="550"/>
-              <w:gridCol w:w="660"/>
-              <w:gridCol w:w="220"/>
-              <w:gridCol w:w="990"/>
+              <w:gridCol w:w="1980"/>
+              <w:gridCol w:w="1980"/>
+              <w:gridCol w:w="1980"/>
+              <w:gridCol w:w="1980"/>
             </w:tblGrid>
             <w:tr>
               <w:trPr>
                 <w:tblHeader w:val="on"/>
               </w:trPr>
               <w:tc>
-                <w:tcPr>
-                  <w:gridSpan w:val="2"/>
-                </w:tcPr>
+                <w:tcPr/>
                 <w:p>
                   <w:pPr>
                     <w:pStyle w:val="Compact"/>
@@ -2319,165 +2360,53 @@
                     <w:jc w:val="center"/>
                   </w:pPr>
                   <w:r>
-                    <w:t xml:space="preserve">Nationality cluster</w:t>
-                  </w:r>
-                </w:p>
-              </w:tc>
-              <w:tc>
-                <w:tcPr>
-                  <w:gridSpan w:val="6"/>
-                </w:tcPr>
-                <w:p>
-                  <w:pPr>
-                    <w:pStyle w:val="Compact"/>
-                    <w:jc w:val="center"/>
-                    <w:jc w:val="center"/>
-                  </w:pPr>
-                  <w:r>
-                    <w:t xml:space="preserve">Wave 0 | Wave 1 | Wave 2</w:t>
-                  </w:r>
-                  <w:r>
-                    <w:t xml:space="preserve"> </w:t>
-                  </w:r>
-                  <w:r>
-                    <w:t xml:space="preserve">(seeds) | |</w:t>
+                    <w:t xml:space="preserve">Characteristic</w:t>
+                  </w:r>
+                </w:p>
+              </w:tc>
+              <w:tc>
+                <w:tcPr/>
+                <w:p>
+                  <w:pPr>
+                    <w:pStyle w:val="Compact"/>
+                    <w:jc w:val="left"/>
+                    <w:jc w:val="center"/>
+                  </w:pPr>
+                  <w:r>
+                    <w:t xml:space="preserve">Category</w:t>
+                  </w:r>
+                </w:p>
+              </w:tc>
+              <w:tc>
+                <w:tcPr/>
+                <w:p>
+                  <w:pPr>
+                    <w:pStyle w:val="Compact"/>
+                    <w:jc w:val="right"/>
+                    <w:jc w:val="center"/>
+                  </w:pPr>
+                  <w:r>
+                    <w:t xml:space="preserve">n</w:t>
+                  </w:r>
+                </w:p>
+              </w:tc>
+              <w:tc>
+                <w:tcPr/>
+                <w:p>
+                  <w:pPr>
+                    <w:pStyle w:val="Compact"/>
+                    <w:jc w:val="right"/>
+                    <w:jc w:val="center"/>
+                  </w:pPr>
+                  <w:r>
+                    <w:t xml:space="preserve">%</w:t>
                   </w:r>
                 </w:p>
               </w:tc>
             </w:tr>
             <w:tr>
               <w:tc>
-                <w:tcPr>
-                  <w:gridSpan w:val="2"/>
-                </w:tcPr>
-                <w:p>
-                  <w:pPr>
-                    <w:pStyle w:val="Compact"/>
-                    <w:jc w:val="left"/>
-                    <w:jc w:val="center"/>
-                  </w:pPr>
-                  <w:r>
-                    <w:t xml:space="preserve">Filipino</w:t>
-                  </w:r>
-                </w:p>
-              </w:tc>
-              <w:tc>
-                <w:tcPr>
-                  <w:gridSpan w:val="6"/>
-                </w:tcPr>
-                <w:p>
-                  <w:pPr>
-                    <w:pStyle w:val="Compact"/>
-                    <w:jc w:val="center"/>
-                    <w:jc w:val="center"/>
-                  </w:pPr>
-                  <w:r>
-                    <w:t xml:space="preserve">35 | 18 | 9</w:t>
-                  </w:r>
-                </w:p>
-              </w:tc>
-            </w:tr>
-            <w:tr>
-              <w:tc>
-                <w:tcPr>
-                  <w:gridSpan w:val="2"/>
-                </w:tcPr>
-                <w:p>
-                  <w:pPr>
-                    <w:pStyle w:val="Compact"/>
-                    <w:jc w:val="left"/>
-                    <w:jc w:val="center"/>
-                  </w:pPr>
-                  <w:r>
-                    <w:t xml:space="preserve">Latinx</w:t>
-                  </w:r>
-                </w:p>
-              </w:tc>
-              <w:tc>
-                <w:tcPr>
-                  <w:gridSpan w:val="6"/>
-                </w:tcPr>
-                <w:p>
-                  <w:pPr>
-                    <w:pStyle w:val="Compact"/>
-                    <w:jc w:val="center"/>
-                    <w:jc w:val="center"/>
-                  </w:pPr>
-                  <w:r>
-                    <w:t xml:space="preserve">4 | 2 | 0</w:t>
-                  </w:r>
-                </w:p>
-              </w:tc>
-            </w:tr>
-            <w:tr>
-              <w:tc>
-                <w:tcPr>
-                  <w:gridSpan w:val="2"/>
-                </w:tcPr>
-                <w:p>
-                  <w:pPr>
-                    <w:pStyle w:val="Compact"/>
-                    <w:jc w:val="left"/>
-                    <w:jc w:val="center"/>
-                  </w:pPr>
-                  <w:r>
-                    <w:t xml:space="preserve">British</w:t>
-                  </w:r>
-                </w:p>
-              </w:tc>
-              <w:tc>
-                <w:tcPr>
-                  <w:gridSpan w:val="6"/>
-                </w:tcPr>
-                <w:p>
-                  <w:pPr>
-                    <w:pStyle w:val="Compact"/>
-                    <w:jc w:val="center"/>
-                    <w:jc w:val="center"/>
-                  </w:pPr>
-                  <w:r>
-                    <w:t xml:space="preserve">2 | 0 | 0</w:t>
-                  </w:r>
-                </w:p>
-              </w:tc>
-            </w:tr>
-            <w:tr>
-              <w:tc>
-                <w:tcPr>
-                  <w:gridSpan w:val="2"/>
-                </w:tcPr>
-                <w:p>
-                  <w:pPr>
-                    <w:pStyle w:val="Compact"/>
-                    <w:jc w:val="left"/>
-                    <w:jc w:val="center"/>
-                  </w:pPr>
-                  <w:r>
-                    <w:t xml:space="preserve">Other</w:t>
-                  </w:r>
-                </w:p>
-              </w:tc>
-              <w:tc>
-                <w:tcPr>
-                  <w:gridSpan w:val="6"/>
-                </w:tcPr>
-                <w:p>
-                  <w:pPr>
-                    <w:pStyle w:val="Compact"/>
-                    <w:jc w:val="center"/>
-                    <w:jc w:val="center"/>
-                  </w:pPr>
-                  <w:r>
-                    <w:t xml:space="preserve">5 | 5 | 2</w:t>
-                  </w:r>
-                </w:p>
-              </w:tc>
-            </w:tr>
-            <w:tr>
-              <w:tc>
-                <w:tcPr>
-                  <w:gridSpan w:val="2"/>
-                </w:tcPr>
+                <w:tcPr/>
                 <w:p>
                   <w:pPr>
                     <w:pStyle w:val="Compact"/>
@@ -2489,18 +2418,106 @@
                       <w:b/>
                       <w:bCs/>
                     </w:rPr>
-                    <w:t xml:space="preserve">Total</w:t>
-                  </w:r>
-                </w:p>
-              </w:tc>
-              <w:tc>
-                <w:tcPr>
-                  <w:gridSpan w:val="6"/>
-                </w:tcPr>
-                <w:p>
-                  <w:pPr>
-                    <w:pStyle w:val="Compact"/>
-                    <w:jc w:val="center"/>
+                    <w:t xml:space="preserve">Gender</w:t>
+                  </w:r>
+                </w:p>
+              </w:tc>
+              <w:tc>
+                <w:tcPr/>
+                <w:p>
+                  <w:pPr>
+                    <w:pStyle w:val="Compact"/>
+                    <w:jc w:val="left"/>
+                    <w:jc w:val="center"/>
+                  </w:pPr>
+                  <w:r>
+                    <w:t xml:space="preserve">Female</w:t>
+                  </w:r>
+                </w:p>
+              </w:tc>
+              <w:tc>
+                <w:tcPr/>
+                <w:p>
+                  <w:pPr>
+                    <w:pStyle w:val="Compact"/>
+                    <w:jc w:val="right"/>
+                    <w:jc w:val="center"/>
+                  </w:pPr>
+                  <w:r>
+                    <w:t xml:space="preserve">83</w:t>
+                  </w:r>
+                </w:p>
+              </w:tc>
+              <w:tc>
+                <w:tcPr/>
+                <w:p>
+                  <w:pPr>
+                    <w:pStyle w:val="Compact"/>
+                    <w:jc w:val="right"/>
+                    <w:jc w:val="center"/>
+                  </w:pPr>
+                  <w:r>
+                    <w:t xml:space="preserve">97.6%</w:t>
+                  </w:r>
+                </w:p>
+              </w:tc>
+            </w:tr>
+            <w:tr>
+              <w:tc>
+                <w:tcPr/>
+                <w:p>
+                  <w:pPr>
+                    <w:pStyle w:val="Compact"/>
+                  </w:pPr>
+                </w:p>
+              </w:tc>
+              <w:tc>
+                <w:tcPr/>
+                <w:p>
+                  <w:pPr>
+                    <w:pStyle w:val="Compact"/>
+                    <w:jc w:val="left"/>
+                    <w:jc w:val="center"/>
+                  </w:pPr>
+                  <w:r>
+                    <w:t xml:space="preserve">Male</w:t>
+                  </w:r>
+                </w:p>
+              </w:tc>
+              <w:tc>
+                <w:tcPr/>
+                <w:p>
+                  <w:pPr>
+                    <w:pStyle w:val="Compact"/>
+                    <w:jc w:val="right"/>
+                    <w:jc w:val="center"/>
+                  </w:pPr>
+                  <w:r>
+                    <w:t xml:space="preserve">2</w:t>
+                  </w:r>
+                </w:p>
+              </w:tc>
+              <w:tc>
+                <w:tcPr/>
+                <w:p>
+                  <w:pPr>
+                    <w:pStyle w:val="Compact"/>
+                    <w:jc w:val="right"/>
+                    <w:jc w:val="center"/>
+                  </w:pPr>
+                  <w:r>
+                    <w:t xml:space="preserve">2.4%</w:t>
+                  </w:r>
+                </w:p>
+              </w:tc>
+            </w:tr>
+            <w:tr>
+              <w:tc>
+                <w:tcPr/>
+                <w:p>
+                  <w:pPr>
+                    <w:pStyle w:val="Compact"/>
+                    <w:jc w:val="left"/>
                     <w:jc w:val="center"/>
                   </w:pPr>
                   <w:r>
@@ -2508,39 +2525,554 @@
                       <w:b/>
                       <w:bCs/>
                     </w:rPr>
-                    <w:t xml:space="preserve">46</w:t>
-                  </w:r>
-                  <w:r>
-                    <w:t xml:space="preserve"> </w:t>
-                  </w:r>
-                  <w:r>
-                    <w:t xml:space="preserve">|</w:t>
-                  </w:r>
-                  <w:r>
-                    <w:t xml:space="preserve"> </w:t>
-                  </w:r>
+                    <w:t xml:space="preserve">Age</w:t>
+                  </w:r>
+                </w:p>
+              </w:tc>
+              <w:tc>
+                <w:tcPr/>
+                <w:p>
+                  <w:pPr>
+                    <w:pStyle w:val="Compact"/>
+                    <w:jc w:val="left"/>
+                    <w:jc w:val="center"/>
+                  </w:pPr>
+                  <w:r>
+                    <w:t xml:space="preserve">23–25</w:t>
+                  </w:r>
+                </w:p>
+              </w:tc>
+              <w:tc>
+                <w:tcPr/>
+                <w:p>
+                  <w:pPr>
+                    <w:pStyle w:val="Compact"/>
+                    <w:jc w:val="right"/>
+                    <w:jc w:val="center"/>
+                  </w:pPr>
+                  <w:r>
+                    <w:t xml:space="preserve">1</w:t>
+                  </w:r>
+                </w:p>
+              </w:tc>
+              <w:tc>
+                <w:tcPr/>
+                <w:p>
+                  <w:pPr>
+                    <w:pStyle w:val="Compact"/>
+                    <w:jc w:val="right"/>
+                    <w:jc w:val="center"/>
+                  </w:pPr>
+                  <w:r>
+                    <w:t xml:space="preserve">1.2%</w:t>
+                  </w:r>
+                </w:p>
+              </w:tc>
+            </w:tr>
+            <w:tr>
+              <w:tc>
+                <w:tcPr/>
+                <w:p>
+                  <w:pPr>
+                    <w:pStyle w:val="Compact"/>
+                  </w:pPr>
+                </w:p>
+              </w:tc>
+              <w:tc>
+                <w:tcPr/>
+                <w:p>
+                  <w:pPr>
+                    <w:pStyle w:val="Compact"/>
+                    <w:jc w:val="left"/>
+                    <w:jc w:val="center"/>
+                  </w:pPr>
+                  <w:r>
+                    <w:t xml:space="preserve">26–35</w:t>
+                  </w:r>
+                </w:p>
+              </w:tc>
+              <w:tc>
+                <w:tcPr/>
+                <w:p>
+                  <w:pPr>
+                    <w:pStyle w:val="Compact"/>
+                    <w:jc w:val="right"/>
+                    <w:jc w:val="center"/>
+                  </w:pPr>
+                  <w:r>
+                    <w:t xml:space="preserve">20</w:t>
+                  </w:r>
+                </w:p>
+              </w:tc>
+              <w:tc>
+                <w:tcPr/>
+                <w:p>
+                  <w:pPr>
+                    <w:pStyle w:val="Compact"/>
+                    <w:jc w:val="right"/>
+                    <w:jc w:val="center"/>
+                  </w:pPr>
+                  <w:r>
+                    <w:t xml:space="preserve">23.5%</w:t>
+                  </w:r>
+                </w:p>
+              </w:tc>
+            </w:tr>
+            <w:tr>
+              <w:tc>
+                <w:tcPr/>
+                <w:p>
+                  <w:pPr>
+                    <w:pStyle w:val="Compact"/>
+                  </w:pPr>
+                </w:p>
+              </w:tc>
+              <w:tc>
+                <w:tcPr/>
+                <w:p>
+                  <w:pPr>
+                    <w:pStyle w:val="Compact"/>
+                    <w:jc w:val="left"/>
+                    <w:jc w:val="center"/>
+                  </w:pPr>
+                  <w:r>
+                    <w:t xml:space="preserve">35–40</w:t>
+                  </w:r>
+                </w:p>
+              </w:tc>
+              <w:tc>
+                <w:tcPr/>
+                <w:p>
+                  <w:pPr>
+                    <w:pStyle w:val="Compact"/>
+                    <w:jc w:val="right"/>
+                    <w:jc w:val="center"/>
+                  </w:pPr>
+                  <w:r>
+                    <w:t xml:space="preserve">22</w:t>
+                  </w:r>
+                </w:p>
+              </w:tc>
+              <w:tc>
+                <w:tcPr/>
+                <w:p>
+                  <w:pPr>
+                    <w:pStyle w:val="Compact"/>
+                    <w:jc w:val="right"/>
+                    <w:jc w:val="center"/>
+                  </w:pPr>
+                  <w:r>
+                    <w:t xml:space="preserve">25.9%</w:t>
+                  </w:r>
+                </w:p>
+              </w:tc>
+            </w:tr>
+            <w:tr>
+              <w:tc>
+                <w:tcPr/>
+                <w:p>
+                  <w:pPr>
+                    <w:pStyle w:val="Compact"/>
+                  </w:pPr>
+                </w:p>
+              </w:tc>
+              <w:tc>
+                <w:tcPr/>
+                <w:p>
+                  <w:pPr>
+                    <w:pStyle w:val="Compact"/>
+                    <w:jc w:val="left"/>
+                    <w:jc w:val="center"/>
+                  </w:pPr>
+                  <w:r>
+                    <w:t xml:space="preserve">45+</w:t>
+                  </w:r>
+                </w:p>
+              </w:tc>
+              <w:tc>
+                <w:tcPr/>
+                <w:p>
+                  <w:pPr>
+                    <w:pStyle w:val="Compact"/>
+                    <w:jc w:val="right"/>
+                    <w:jc w:val="center"/>
+                  </w:pPr>
+                  <w:r>
+                    <w:t xml:space="preserve">42</w:t>
+                  </w:r>
+                </w:p>
+              </w:tc>
+              <w:tc>
+                <w:tcPr/>
+                <w:p>
+                  <w:pPr>
+                    <w:pStyle w:val="Compact"/>
+                    <w:jc w:val="right"/>
+                    <w:jc w:val="center"/>
+                  </w:pPr>
+                  <w:r>
+                    <w:t xml:space="preserve">49.4%</w:t>
+                  </w:r>
+                </w:p>
+              </w:tc>
+            </w:tr>
+            <w:tr>
+              <w:tc>
+                <w:tcPr/>
+                <w:p>
+                  <w:pPr>
+                    <w:pStyle w:val="Compact"/>
+                    <w:jc w:val="left"/>
+                    <w:jc w:val="center"/>
+                  </w:pPr>
                   <w:r>
                     <w:rPr>
                       <w:b/>
                       <w:bCs/>
                     </w:rPr>
-                    <w:t xml:space="preserve">25</w:t>
-                  </w:r>
-                  <w:r>
-                    <w:t xml:space="preserve"> </w:t>
-                  </w:r>
-                  <w:r>
-                    <w:t xml:space="preserve">|</w:t>
-                  </w:r>
-                  <w:r>
-                    <w:t xml:space="preserve"> </w:t>
-                  </w:r>
+                    <w:t xml:space="preserve">Employment status</w:t>
+                  </w:r>
+                </w:p>
+              </w:tc>
+              <w:tc>
+                <w:tcPr/>
+                <w:p>
+                  <w:pPr>
+                    <w:pStyle w:val="Compact"/>
+                    <w:jc w:val="left"/>
+                    <w:jc w:val="center"/>
+                  </w:pPr>
+                  <w:r>
+                    <w:t xml:space="preserve">Self-employed</w:t>
+                  </w:r>
+                </w:p>
+              </w:tc>
+              <w:tc>
+                <w:tcPr/>
+                <w:p>
+                  <w:pPr>
+                    <w:pStyle w:val="Compact"/>
+                    <w:jc w:val="right"/>
+                    <w:jc w:val="center"/>
+                  </w:pPr>
+                  <w:r>
+                    <w:t xml:space="preserve">40</w:t>
+                  </w:r>
+                </w:p>
+              </w:tc>
+              <w:tc>
+                <w:tcPr/>
+                <w:p>
+                  <w:pPr>
+                    <w:pStyle w:val="Compact"/>
+                    <w:jc w:val="right"/>
+                    <w:jc w:val="center"/>
+                  </w:pPr>
+                  <w:r>
+                    <w:t xml:space="preserve">47.1%</w:t>
+                  </w:r>
+                </w:p>
+              </w:tc>
+            </w:tr>
+            <w:tr>
+              <w:tc>
+                <w:tcPr/>
+                <w:p>
+                  <w:pPr>
+                    <w:pStyle w:val="Compact"/>
+                  </w:pPr>
+                </w:p>
+              </w:tc>
+              <w:tc>
+                <w:tcPr/>
+                <w:p>
+                  <w:pPr>
+                    <w:pStyle w:val="Compact"/>
+                    <w:jc w:val="left"/>
+                    <w:jc w:val="center"/>
+                  </w:pPr>
+                  <w:r>
+                    <w:t xml:space="preserve">Employee</w:t>
+                  </w:r>
+                </w:p>
+              </w:tc>
+              <w:tc>
+                <w:tcPr/>
+                <w:p>
+                  <w:pPr>
+                    <w:pStyle w:val="Compact"/>
+                    <w:jc w:val="right"/>
+                    <w:jc w:val="center"/>
+                  </w:pPr>
+                  <w:r>
+                    <w:t xml:space="preserve">31</w:t>
+                  </w:r>
+                </w:p>
+              </w:tc>
+              <w:tc>
+                <w:tcPr/>
+                <w:p>
+                  <w:pPr>
+                    <w:pStyle w:val="Compact"/>
+                    <w:jc w:val="right"/>
+                    <w:jc w:val="center"/>
+                  </w:pPr>
+                  <w:r>
+                    <w:t xml:space="preserve">36.5%</w:t>
+                  </w:r>
+                </w:p>
+              </w:tc>
+            </w:tr>
+            <w:tr>
+              <w:tc>
+                <w:tcPr/>
+                <w:p>
+                  <w:pPr>
+                    <w:pStyle w:val="Compact"/>
+                  </w:pPr>
+                </w:p>
+              </w:tc>
+              <w:tc>
+                <w:tcPr/>
+                <w:p>
+                  <w:pPr>
+                    <w:pStyle w:val="Compact"/>
+                    <w:jc w:val="left"/>
+                    <w:jc w:val="center"/>
+                  </w:pPr>
+                  <w:r>
+                    <w:t xml:space="preserve">Agency worker</w:t>
+                  </w:r>
+                </w:p>
+              </w:tc>
+              <w:tc>
+                <w:tcPr/>
+                <w:p>
+                  <w:pPr>
+                    <w:pStyle w:val="Compact"/>
+                    <w:jc w:val="right"/>
+                    <w:jc w:val="center"/>
+                  </w:pPr>
+                  <w:r>
+                    <w:t xml:space="preserve">14</w:t>
+                  </w:r>
+                </w:p>
+              </w:tc>
+              <w:tc>
+                <w:tcPr/>
+                <w:p>
+                  <w:pPr>
+                    <w:pStyle w:val="Compact"/>
+                    <w:jc w:val="right"/>
+                    <w:jc w:val="center"/>
+                  </w:pPr>
+                  <w:r>
+                    <w:t xml:space="preserve">16.5%</w:t>
+                  </w:r>
+                </w:p>
+              </w:tc>
+            </w:tr>
+            <w:tr>
+              <w:tc>
+                <w:tcPr/>
+                <w:p>
+                  <w:pPr>
+                    <w:pStyle w:val="Compact"/>
+                    <w:jc w:val="left"/>
+                    <w:jc w:val="center"/>
+                  </w:pPr>
                   <w:r>
                     <w:rPr>
                       <w:b/>
                       <w:bCs/>
                     </w:rPr>
-                    <w:t xml:space="preserve">11</w:t>
+                    <w:t xml:space="preserve">Length of time in UK</w:t>
+                  </w:r>
+                </w:p>
+              </w:tc>
+              <w:tc>
+                <w:tcPr/>
+                <w:p>
+                  <w:pPr>
+                    <w:pStyle w:val="Compact"/>
+                    <w:jc w:val="left"/>
+                    <w:jc w:val="center"/>
+                  </w:pPr>
+                  <w:r>
+                    <w:t xml:space="preserve">Less than 3 months</w:t>
+                  </w:r>
+                </w:p>
+              </w:tc>
+              <w:tc>
+                <w:tcPr/>
+                <w:p>
+                  <w:pPr>
+                    <w:pStyle w:val="Compact"/>
+                    <w:jc w:val="right"/>
+                    <w:jc w:val="center"/>
+                  </w:pPr>
+                  <w:r>
+                    <w:t xml:space="preserve">3</w:t>
+                  </w:r>
+                </w:p>
+              </w:tc>
+              <w:tc>
+                <w:tcPr/>
+                <w:p>
+                  <w:pPr>
+                    <w:pStyle w:val="Compact"/>
+                    <w:jc w:val="right"/>
+                    <w:jc w:val="center"/>
+                  </w:pPr>
+                  <w:r>
+                    <w:t xml:space="preserve">3.5%</w:t>
+                  </w:r>
+                </w:p>
+              </w:tc>
+            </w:tr>
+            <w:tr>
+              <w:tc>
+                <w:tcPr/>
+                <w:p>
+                  <w:pPr>
+                    <w:pStyle w:val="Compact"/>
+                  </w:pPr>
+                </w:p>
+              </w:tc>
+              <w:tc>
+                <w:tcPr/>
+                <w:p>
+                  <w:pPr>
+                    <w:pStyle w:val="Compact"/>
+                    <w:jc w:val="left"/>
+                    <w:jc w:val="center"/>
+                  </w:pPr>
+                  <w:r>
+                    <w:t xml:space="preserve">3 months to 1 year</w:t>
+                  </w:r>
+                </w:p>
+              </w:tc>
+              <w:tc>
+                <w:tcPr/>
+                <w:p>
+                  <w:pPr>
+                    <w:pStyle w:val="Compact"/>
+                    <w:jc w:val="right"/>
+                    <w:jc w:val="center"/>
+                  </w:pPr>
+                  <w:r>
+                    <w:t xml:space="preserve">19</w:t>
+                  </w:r>
+                </w:p>
+              </w:tc>
+              <w:tc>
+                <w:tcPr/>
+                <w:p>
+                  <w:pPr>
+                    <w:pStyle w:val="Compact"/>
+                    <w:jc w:val="right"/>
+                    <w:jc w:val="center"/>
+                  </w:pPr>
+                  <w:r>
+                    <w:t xml:space="preserve">22.4%</w:t>
+                  </w:r>
+                </w:p>
+              </w:tc>
+            </w:tr>
+            <w:tr>
+              <w:tc>
+                <w:tcPr/>
+                <w:p>
+                  <w:pPr>
+                    <w:pStyle w:val="Compact"/>
+                  </w:pPr>
+                </w:p>
+              </w:tc>
+              <w:tc>
+                <w:tcPr/>
+                <w:p>
+                  <w:pPr>
+                    <w:pStyle w:val="Compact"/>
+                    <w:jc w:val="left"/>
+                    <w:jc w:val="center"/>
+                  </w:pPr>
+                  <w:r>
+                    <w:t xml:space="preserve">1 to 3 years</w:t>
+                  </w:r>
+                </w:p>
+              </w:tc>
+              <w:tc>
+                <w:tcPr/>
+                <w:p>
+                  <w:pPr>
+                    <w:pStyle w:val="Compact"/>
+                    <w:jc w:val="right"/>
+                    <w:jc w:val="center"/>
+                  </w:pPr>
+                  <w:r>
+                    <w:t xml:space="preserve">14</w:t>
+                  </w:r>
+                </w:p>
+              </w:tc>
+              <w:tc>
+                <w:tcPr/>
+                <w:p>
+                  <w:pPr>
+                    <w:pStyle w:val="Compact"/>
+                    <w:jc w:val="right"/>
+                    <w:jc w:val="center"/>
+                  </w:pPr>
+                  <w:r>
+                    <w:t xml:space="preserve">16.5%</w:t>
+                  </w:r>
+                </w:p>
+              </w:tc>
+            </w:tr>
+            <w:tr>
+              <w:tc>
+                <w:tcPr/>
+                <w:p>
+                  <w:pPr>
+                    <w:pStyle w:val="Compact"/>
+                  </w:pPr>
+                </w:p>
+              </w:tc>
+              <w:tc>
+                <w:tcPr/>
+                <w:p>
+                  <w:pPr>
+                    <w:pStyle w:val="Compact"/>
+                    <w:jc w:val="left"/>
+                    <w:jc w:val="center"/>
+                  </w:pPr>
+                  <w:r>
+                    <w:t xml:space="preserve">More than 3 years</w:t>
+                  </w:r>
+                </w:p>
+              </w:tc>
+              <w:tc>
+                <w:tcPr/>
+                <w:p>
+                  <w:pPr>
+                    <w:pStyle w:val="Compact"/>
+                    <w:jc w:val="right"/>
+                    <w:jc w:val="center"/>
+                  </w:pPr>
+                  <w:r>
+                    <w:t xml:space="preserve">49</w:t>
+                  </w:r>
+                </w:p>
+              </w:tc>
+              <w:tc>
+                <w:tcPr/>
+                <w:p>
+                  <w:pPr>
+                    <w:pStyle w:val="Compact"/>
+                    <w:jc w:val="right"/>
+                    <w:jc w:val="center"/>
+                  </w:pPr>
+                  <w:r>
+                    <w:t xml:space="preserve">57.6%</w:t>
                   </w:r>
                 </w:p>
               </w:tc>
@@ -2551,52 +3083,12 @@
         </w:tc>
       </w:tr>
     </w:tbl>
-    <w:bookmarkEnd w:id="31"/>
-    <w:bookmarkStart w:id="35" w:name="sec-estimation-framework"/>
-    <w:p>
-      <w:pPr>
-        <w:pStyle w:val="Heading2"/>
-      </w:pPr>
-      <w:r>
-        <w:t xml:space="preserve">3.4 Estimation Framework</w:t>
-      </w:r>
-    </w:p>
-    <w:p>
-      <w:pPr>
-        <w:pStyle w:val="FirstParagraph"/>
-      </w:pPr>
-      <w:r>
-        <w:t xml:space="preserve">Before describing each estimator in turn,</w:t>
-      </w:r>
-      <w:r>
-        <w:t xml:space="preserve"> </w:t>
-      </w:r>
-      <w:hyperlink w:anchor="tbl-estimands">
-        <w:r>
-          <w:rPr>
-            <w:rStyle w:val="Hyperlink"/>
-          </w:rPr>
-          <w:t xml:space="preserve">Table 3</w:t>
-        </w:r>
-      </w:hyperlink>
-      <w:r>
-        <w:t xml:space="preserve"> </w:t>
-      </w:r>
-      <w:r>
-        <w:t xml:space="preserve">summarises the information each method uses, the population quantity each method targets (its</w:t>
-      </w:r>
-      <w:r>
-        <w:t xml:space="preserve"> </w:t>
-      </w:r>
-      <w:r>
-        <w:rPr>
-          <w:i/>
-          <w:iCs/>
-        </w:rPr>
-        <w:t xml:space="preserve">estimand</w:t>
-      </w:r>
-      <w:r>
-        <w:t xml:space="preserve">), and the principal source of identification risk for each. The four estimators do not target the same quantity. RDS-SS and MA-RDS estimate own-experience prevalence among the RDS-reachable population of migrant domestic workers; NSUM estimates network-visible prevalence among domestic-worker alters as reported by the respondent; the composite risk index targets the RDS-adjusted mean severity score. The order-of-magnitude RDS–NSUM gap should not be read as two methods disagreeing about the same estimand. RDS estimates own-experience prevalence, whereas NSUM estimates network-visible prevalence among alters; the divergence is therefore substantively interpretable rather than merely a discrepancy.</w:t>
+    <w:p>
+      <w:pPr>
+        <w:pStyle w:val="BodyText"/>
+      </w:pPr>
+      <w:r>
+        <w:t xml:space="preserve"> </w:t>
       </w:r>
     </w:p>
     <w:tbl>
@@ -2612,7 +3104,7 @@
       <w:tr>
         <w:tc>
           <w:tcPr/>
-          <w:bookmarkStart w:id="32" w:name="tbl-estimands"/>
+          <w:bookmarkStart w:id="31" w:name="tbl-sample-chars"/>
           <w:p>
             <w:pPr>
               <w:jc w:val="center"/>
@@ -2623,7 +3115,610 @@
               <w:pStyle w:val="ImageCaption"/>
             </w:pPr>
             <w:r>
-              <w:t xml:space="preserve">Table 3: Estimands and identification vulnerabilities of the four estimators applied in this paper. Each row characterises one estimator: what information from the survey it uses, what population quantity it targets, and what the principal threat to identification is. Source: Authors’ construction.</w:t>
+              <w:t xml:space="preserve">Table 3: Sample composition by nationality cluster and recruitment wave (n = 85). Wave 0 indicates seed respondents; subsequent waves are respondent-driven recruits. Filipino respondents dominate the sample (76%) and contribute the deepest recruitment chains; other nationality clusters are smaller and shallower. Source: Authors’ own work.</w:t>
+            </w:r>
+          </w:p>
+          <w:tbl>
+            <w:tblPr>
+              <w:tblStyle w:val="Table"/>
+              <w:tblW w:type="pct" w:w="5000"/>
+              <w:tblLayout w:type="fixed"/>
+              <w:tblLook w:firstRow="1" w:lastRow="0" w:firstColumn="0" w:lastColumn="0" w:noHBand="0" w:noVBand="0" w:val="0020"/>
+            </w:tblPr>
+            <w:tblGrid>
+              <w:gridCol w:w="2278"/>
+              <w:gridCol w:w="1735"/>
+              <w:gridCol w:w="867"/>
+              <w:gridCol w:w="867"/>
+              <w:gridCol w:w="976"/>
+              <w:gridCol w:w="1193"/>
+            </w:tblGrid>
+            <w:tr>
+              <w:trPr>
+                <w:tblHeader w:val="on"/>
+              </w:trPr>
+              <w:tc>
+                <w:tcPr/>
+                <w:p>
+                  <w:pPr>
+                    <w:pStyle w:val="Compact"/>
+                    <w:jc w:val="left"/>
+                    <w:jc w:val="center"/>
+                  </w:pPr>
+                  <w:r>
+                    <w:t xml:space="preserve">Nationality cluster</w:t>
+                  </w:r>
+                </w:p>
+              </w:tc>
+              <w:tc>
+                <w:tcPr/>
+                <w:p>
+                  <w:pPr>
+                    <w:pStyle w:val="Compact"/>
+                    <w:jc w:val="right"/>
+                    <w:jc w:val="center"/>
+                  </w:pPr>
+                  <w:r>
+                    <w:t xml:space="preserve">Wave 0 (seeds)</w:t>
+                  </w:r>
+                </w:p>
+              </w:tc>
+              <w:tc>
+                <w:tcPr/>
+                <w:p>
+                  <w:pPr>
+                    <w:pStyle w:val="Compact"/>
+                    <w:jc w:val="right"/>
+                    <w:jc w:val="center"/>
+                  </w:pPr>
+                  <w:r>
+                    <w:t xml:space="preserve">Wave 1</w:t>
+                  </w:r>
+                </w:p>
+              </w:tc>
+              <w:tc>
+                <w:tcPr/>
+                <w:p>
+                  <w:pPr>
+                    <w:pStyle w:val="Compact"/>
+                    <w:jc w:val="right"/>
+                    <w:jc w:val="center"/>
+                  </w:pPr>
+                  <w:r>
+                    <w:t xml:space="preserve">Wave 2</w:t>
+                  </w:r>
+                </w:p>
+              </w:tc>
+              <w:tc>
+                <w:tcPr/>
+                <w:p>
+                  <w:pPr>
+                    <w:pStyle w:val="Compact"/>
+                    <w:jc w:val="right"/>
+                    <w:jc w:val="center"/>
+                  </w:pPr>
+                  <w:r>
+                    <w:t xml:space="preserve">Wave 3+</w:t>
+                  </w:r>
+                </w:p>
+              </w:tc>
+              <w:tc>
+                <w:tcPr/>
+                <w:p>
+                  <w:pPr>
+                    <w:pStyle w:val="Compact"/>
+                    <w:jc w:val="right"/>
+                    <w:jc w:val="center"/>
+                  </w:pPr>
+                  <w:r>
+                    <w:t xml:space="preserve">Total (n)</w:t>
+                  </w:r>
+                </w:p>
+              </w:tc>
+            </w:tr>
+            <w:tr>
+              <w:tc>
+                <w:tcPr/>
+                <w:p>
+                  <w:pPr>
+                    <w:pStyle w:val="Compact"/>
+                    <w:jc w:val="left"/>
+                    <w:jc w:val="center"/>
+                  </w:pPr>
+                  <w:r>
+                    <w:t xml:space="preserve">Filipino</w:t>
+                  </w:r>
+                </w:p>
+              </w:tc>
+              <w:tc>
+                <w:tcPr/>
+                <w:p>
+                  <w:pPr>
+                    <w:pStyle w:val="Compact"/>
+                    <w:jc w:val="right"/>
+                    <w:jc w:val="center"/>
+                  </w:pPr>
+                  <w:r>
+                    <w:t xml:space="preserve">35</w:t>
+                  </w:r>
+                </w:p>
+              </w:tc>
+              <w:tc>
+                <w:tcPr/>
+                <w:p>
+                  <w:pPr>
+                    <w:pStyle w:val="Compact"/>
+                    <w:jc w:val="right"/>
+                    <w:jc w:val="center"/>
+                  </w:pPr>
+                  <w:r>
+                    <w:t xml:space="preserve">18</w:t>
+                  </w:r>
+                </w:p>
+              </w:tc>
+              <w:tc>
+                <w:tcPr/>
+                <w:p>
+                  <w:pPr>
+                    <w:pStyle w:val="Compact"/>
+                    <w:jc w:val="right"/>
+                    <w:jc w:val="center"/>
+                  </w:pPr>
+                  <w:r>
+                    <w:t xml:space="preserve">9</w:t>
+                  </w:r>
+                </w:p>
+              </w:tc>
+              <w:tc>
+                <w:tcPr/>
+                <w:p>
+                  <w:pPr>
+                    <w:pStyle w:val="Compact"/>
+                    <w:jc w:val="right"/>
+                    <w:jc w:val="center"/>
+                  </w:pPr>
+                  <w:r>
+                    <w:t xml:space="preserve">3</w:t>
+                  </w:r>
+                </w:p>
+              </w:tc>
+              <w:tc>
+                <w:tcPr/>
+                <w:p>
+                  <w:pPr>
+                    <w:pStyle w:val="Compact"/>
+                    <w:jc w:val="right"/>
+                    <w:jc w:val="center"/>
+                  </w:pPr>
+                  <w:r>
+                    <w:t xml:space="preserve">65</w:t>
+                  </w:r>
+                </w:p>
+              </w:tc>
+            </w:tr>
+            <w:tr>
+              <w:tc>
+                <w:tcPr/>
+                <w:p>
+                  <w:pPr>
+                    <w:pStyle w:val="Compact"/>
+                    <w:jc w:val="left"/>
+                    <w:jc w:val="center"/>
+                  </w:pPr>
+                  <w:r>
+                    <w:t xml:space="preserve">Latinx</w:t>
+                  </w:r>
+                </w:p>
+              </w:tc>
+              <w:tc>
+                <w:tcPr/>
+                <w:p>
+                  <w:pPr>
+                    <w:pStyle w:val="Compact"/>
+                    <w:jc w:val="right"/>
+                    <w:jc w:val="center"/>
+                  </w:pPr>
+                  <w:r>
+                    <w:t xml:space="preserve">4</w:t>
+                  </w:r>
+                </w:p>
+              </w:tc>
+              <w:tc>
+                <w:tcPr/>
+                <w:p>
+                  <w:pPr>
+                    <w:pStyle w:val="Compact"/>
+                    <w:jc w:val="right"/>
+                    <w:jc w:val="center"/>
+                  </w:pPr>
+                  <w:r>
+                    <w:t xml:space="preserve">2</w:t>
+                  </w:r>
+                </w:p>
+              </w:tc>
+              <w:tc>
+                <w:tcPr/>
+                <w:p>
+                  <w:pPr>
+                    <w:pStyle w:val="Compact"/>
+                    <w:jc w:val="right"/>
+                    <w:jc w:val="center"/>
+                  </w:pPr>
+                  <w:r>
+                    <w:t xml:space="preserve">0</w:t>
+                  </w:r>
+                </w:p>
+              </w:tc>
+              <w:tc>
+                <w:tcPr/>
+                <w:p>
+                  <w:pPr>
+                    <w:pStyle w:val="Compact"/>
+                    <w:jc w:val="right"/>
+                    <w:jc w:val="center"/>
+                  </w:pPr>
+                  <w:r>
+                    <w:t xml:space="preserve">0</w:t>
+                  </w:r>
+                </w:p>
+              </w:tc>
+              <w:tc>
+                <w:tcPr/>
+                <w:p>
+                  <w:pPr>
+                    <w:pStyle w:val="Compact"/>
+                    <w:jc w:val="right"/>
+                    <w:jc w:val="center"/>
+                  </w:pPr>
+                  <w:r>
+                    <w:t xml:space="preserve">6</w:t>
+                  </w:r>
+                </w:p>
+              </w:tc>
+            </w:tr>
+            <w:tr>
+              <w:tc>
+                <w:tcPr/>
+                <w:p>
+                  <w:pPr>
+                    <w:pStyle w:val="Compact"/>
+                    <w:jc w:val="left"/>
+                    <w:jc w:val="center"/>
+                  </w:pPr>
+                  <w:r>
+                    <w:t xml:space="preserve">British</w:t>
+                  </w:r>
+                </w:p>
+              </w:tc>
+              <w:tc>
+                <w:tcPr/>
+                <w:p>
+                  <w:pPr>
+                    <w:pStyle w:val="Compact"/>
+                    <w:jc w:val="right"/>
+                    <w:jc w:val="center"/>
+                  </w:pPr>
+                  <w:r>
+                    <w:t xml:space="preserve">2</w:t>
+                  </w:r>
+                </w:p>
+              </w:tc>
+              <w:tc>
+                <w:tcPr/>
+                <w:p>
+                  <w:pPr>
+                    <w:pStyle w:val="Compact"/>
+                    <w:jc w:val="right"/>
+                    <w:jc w:val="center"/>
+                  </w:pPr>
+                  <w:r>
+                    <w:t xml:space="preserve">0</w:t>
+                  </w:r>
+                </w:p>
+              </w:tc>
+              <w:tc>
+                <w:tcPr/>
+                <w:p>
+                  <w:pPr>
+                    <w:pStyle w:val="Compact"/>
+                    <w:jc w:val="right"/>
+                    <w:jc w:val="center"/>
+                  </w:pPr>
+                  <w:r>
+                    <w:t xml:space="preserve">0</w:t>
+                  </w:r>
+                </w:p>
+              </w:tc>
+              <w:tc>
+                <w:tcPr/>
+                <w:p>
+                  <w:pPr>
+                    <w:pStyle w:val="Compact"/>
+                    <w:jc w:val="right"/>
+                    <w:jc w:val="center"/>
+                  </w:pPr>
+                  <w:r>
+                    <w:t xml:space="preserve">0</w:t>
+                  </w:r>
+                </w:p>
+              </w:tc>
+              <w:tc>
+                <w:tcPr/>
+                <w:p>
+                  <w:pPr>
+                    <w:pStyle w:val="Compact"/>
+                    <w:jc w:val="right"/>
+                    <w:jc w:val="center"/>
+                  </w:pPr>
+                  <w:r>
+                    <w:t xml:space="preserve">2</w:t>
+                  </w:r>
+                </w:p>
+              </w:tc>
+            </w:tr>
+            <w:tr>
+              <w:tc>
+                <w:tcPr/>
+                <w:p>
+                  <w:pPr>
+                    <w:pStyle w:val="Compact"/>
+                    <w:jc w:val="left"/>
+                    <w:jc w:val="center"/>
+                  </w:pPr>
+                  <w:r>
+                    <w:t xml:space="preserve">Other</w:t>
+                  </w:r>
+                </w:p>
+              </w:tc>
+              <w:tc>
+                <w:tcPr/>
+                <w:p>
+                  <w:pPr>
+                    <w:pStyle w:val="Compact"/>
+                    <w:jc w:val="right"/>
+                    <w:jc w:val="center"/>
+                  </w:pPr>
+                  <w:r>
+                    <w:t xml:space="preserve">5</w:t>
+                  </w:r>
+                </w:p>
+              </w:tc>
+              <w:tc>
+                <w:tcPr/>
+                <w:p>
+                  <w:pPr>
+                    <w:pStyle w:val="Compact"/>
+                    <w:jc w:val="right"/>
+                    <w:jc w:val="center"/>
+                  </w:pPr>
+                  <w:r>
+                    <w:t xml:space="preserve">5</w:t>
+                  </w:r>
+                </w:p>
+              </w:tc>
+              <w:tc>
+                <w:tcPr/>
+                <w:p>
+                  <w:pPr>
+                    <w:pStyle w:val="Compact"/>
+                    <w:jc w:val="right"/>
+                    <w:jc w:val="center"/>
+                  </w:pPr>
+                  <w:r>
+                    <w:t xml:space="preserve">2</w:t>
+                  </w:r>
+                </w:p>
+              </w:tc>
+              <w:tc>
+                <w:tcPr/>
+                <w:p>
+                  <w:pPr>
+                    <w:pStyle w:val="Compact"/>
+                    <w:jc w:val="right"/>
+                    <w:jc w:val="center"/>
+                  </w:pPr>
+                  <w:r>
+                    <w:t xml:space="preserve">0</w:t>
+                  </w:r>
+                </w:p>
+              </w:tc>
+              <w:tc>
+                <w:tcPr/>
+                <w:p>
+                  <w:pPr>
+                    <w:pStyle w:val="Compact"/>
+                    <w:jc w:val="right"/>
+                    <w:jc w:val="center"/>
+                  </w:pPr>
+                  <w:r>
+                    <w:t xml:space="preserve">12</w:t>
+                  </w:r>
+                </w:p>
+              </w:tc>
+            </w:tr>
+            <w:tr>
+              <w:tc>
+                <w:tcPr/>
+                <w:p>
+                  <w:pPr>
+                    <w:pStyle w:val="Compact"/>
+                    <w:jc w:val="left"/>
+                    <w:jc w:val="center"/>
+                  </w:pPr>
+                  <w:r>
+                    <w:rPr>
+                      <w:b/>
+                      <w:bCs/>
+                    </w:rPr>
+                    <w:t xml:space="preserve">Total</w:t>
+                  </w:r>
+                </w:p>
+              </w:tc>
+              <w:tc>
+                <w:tcPr/>
+                <w:p>
+                  <w:pPr>
+                    <w:pStyle w:val="Compact"/>
+                    <w:jc w:val="right"/>
+                    <w:jc w:val="center"/>
+                  </w:pPr>
+                  <w:r>
+                    <w:rPr>
+                      <w:b/>
+                      <w:bCs/>
+                    </w:rPr>
+                    <w:t xml:space="preserve">46</w:t>
+                  </w:r>
+                </w:p>
+              </w:tc>
+              <w:tc>
+                <w:tcPr/>
+                <w:p>
+                  <w:pPr>
+                    <w:pStyle w:val="Compact"/>
+                    <w:jc w:val="right"/>
+                    <w:jc w:val="center"/>
+                  </w:pPr>
+                  <w:r>
+                    <w:rPr>
+                      <w:b/>
+                      <w:bCs/>
+                    </w:rPr>
+                    <w:t xml:space="preserve">25</w:t>
+                  </w:r>
+                </w:p>
+              </w:tc>
+              <w:tc>
+                <w:tcPr/>
+                <w:p>
+                  <w:pPr>
+                    <w:pStyle w:val="Compact"/>
+                    <w:jc w:val="right"/>
+                    <w:jc w:val="center"/>
+                  </w:pPr>
+                  <w:r>
+                    <w:rPr>
+                      <w:b/>
+                      <w:bCs/>
+                    </w:rPr>
+                    <w:t xml:space="preserve">11</w:t>
+                  </w:r>
+                </w:p>
+              </w:tc>
+              <w:tc>
+                <w:tcPr/>
+                <w:p>
+                  <w:pPr>
+                    <w:pStyle w:val="Compact"/>
+                    <w:jc w:val="right"/>
+                    <w:jc w:val="center"/>
+                  </w:pPr>
+                  <w:r>
+                    <w:rPr>
+                      <w:b/>
+                      <w:bCs/>
+                    </w:rPr>
+                    <w:t xml:space="preserve">3</w:t>
+                  </w:r>
+                </w:p>
+              </w:tc>
+              <w:tc>
+                <w:tcPr/>
+                <w:p>
+                  <w:pPr>
+                    <w:pStyle w:val="Compact"/>
+                    <w:jc w:val="right"/>
+                    <w:jc w:val="center"/>
+                  </w:pPr>
+                  <w:r>
+                    <w:rPr>
+                      <w:b/>
+                      <w:bCs/>
+                    </w:rPr>
+                    <w:t xml:space="preserve">85</w:t>
+                  </w:r>
+                </w:p>
+              </w:tc>
+            </w:tr>
+          </w:tbl>
+          <w:bookmarkEnd w:id="31"/>
+          <w:p/>
+        </w:tc>
+      </w:tr>
+    </w:tbl>
+    <w:bookmarkEnd w:id="32"/>
+    <w:bookmarkStart w:id="36" w:name="sec-estimation-framework"/>
+    <w:p>
+      <w:pPr>
+        <w:pStyle w:val="Heading2"/>
+      </w:pPr>
+      <w:r>
+        <w:t xml:space="preserve">3.4 Estimation Framework</w:t>
+      </w:r>
+    </w:p>
+    <w:p>
+      <w:pPr>
+        <w:pStyle w:val="FirstParagraph"/>
+      </w:pPr>
+      <w:r>
+        <w:t xml:space="preserve">Before describing each estimator in turn,</w:t>
+      </w:r>
+      <w:r>
+        <w:t xml:space="preserve"> </w:t>
+      </w:r>
+      <w:hyperlink w:anchor="tbl-estimands">
+        <w:r>
+          <w:rPr>
+            <w:rStyle w:val="Hyperlink"/>
+          </w:rPr>
+          <w:t xml:space="preserve">Table 4</w:t>
+        </w:r>
+      </w:hyperlink>
+      <w:r>
+        <w:t xml:space="preserve"> </w:t>
+      </w:r>
+      <w:r>
+        <w:t xml:space="preserve">summarises the information each method uses, the population quantity each method targets (its</w:t>
+      </w:r>
+      <w:r>
+        <w:t xml:space="preserve"> </w:t>
+      </w:r>
+      <w:r>
+        <w:rPr>
+          <w:i/>
+          <w:iCs/>
+        </w:rPr>
+        <w:t xml:space="preserve">estimand</w:t>
+      </w:r>
+      <w:r>
+        <w:t xml:space="preserve">), and the principal source of identification risk for each. The four estimators do not target the same quantity. RDS-SS and MA-RDS estimate own-experience prevalence among the RDS-reachable population of migrant domestic workers; NSUM estimates network-visible prevalence among domestic-worker alters as reported by the respondent; the composite risk index targets the RDS-adjusted mean severity score. The order-of-magnitude RDS–NSUM gap should not be read as two methods disagreeing about the same estimand. RDS estimates own-experience prevalence, whereas NSUM estimates network-visible prevalence among alters; the divergence is therefore substantively interpretable rather than merely a discrepancy.</w:t>
+      </w:r>
+    </w:p>
+    <w:tbl>
+      <w:tblPr>
+        <w:tblStyle w:val="Table"/>
+        <w:tblW w:type="pct" w:w="5000"/>
+        <w:tblLayout w:type="fixed"/>
+        <w:tblLook w:firstRow="0" w:lastRow="0" w:firstColumn="0" w:lastColumn="0" w:noHBand="0" w:noVBand="0" w:val="0000"/>
+      </w:tblPr>
+      <w:tblGrid>
+        <w:gridCol w:w="7920"/>
+      </w:tblGrid>
+      <w:tr>
+        <w:tc>
+          <w:tcPr/>
+          <w:bookmarkStart w:id="33" w:name="tbl-estimands"/>
+          <w:p>
+            <w:pPr>
+              <w:jc w:val="center"/>
+            </w:pPr>
+            <w:pPr>
+              <w:jc w:val="start"/>
+              <w:spacing w:before="200"/>
+              <w:pStyle w:val="ImageCaption"/>
+            </w:pPr>
+            <w:r>
+              <w:t xml:space="preserve">Table 4: Estimands and identification vulnerabilities of the four estimators applied in this paper. Each row characterises one estimator: what information from the survey it uses, what population quantity it targets, and what the principal threat to identification is. Source: Authors’ construction.</w:t>
             </w:r>
           </w:p>
           <w:tbl>
@@ -2932,7 +4027,7 @@
               </w:tc>
             </w:tr>
           </w:tbl>
-          <w:bookmarkEnd w:id="32"/>
+          <w:bookmarkEnd w:id="33"/>
           <w:p/>
         </w:tc>
       </w:tr>
@@ -3128,12 +4223,12 @@
       <w:r>
         <w:t xml:space="preserve"> </w:t>
       </w:r>
-      <w:hyperlink w:anchor="sec-composite-results">
+      <w:hyperlink w:anchor="sec-supporting-estimates">
         <w:r>
           <w:rPr>
             <w:rStyle w:val="Hyperlink"/>
           </w:rPr>
-          <w:t xml:space="preserve">Section 4.2</w:t>
+          <w:t xml:space="preserve">Section 4.4</w:t>
         </w:r>
       </w:hyperlink>
       <w:r>
@@ -3212,7 +4307,7 @@
           <w:rPr>
             <w:rStyle w:val="Hyperlink"/>
           </w:rPr>
-          <w:t xml:space="preserve">Table 3</w:t>
+          <w:t xml:space="preserve">Table 4</w:t>
         </w:r>
       </w:hyperlink>
       <w:r>
@@ -3458,7 +4553,7 @@
       <w:pPr>
         <w:pStyle w:val="BodyText"/>
       </w:pPr>
-      <w:bookmarkStart w:id="33" w:name="eq-1"/>
+      <w:bookmarkStart w:id="34" w:name="eq-1"/>
       <m:oMathPara>
         <m:oMathParaPr>
           <m:jc m:val="center"/>
@@ -3635,7 +4730,7 @@
           </m:d>
         </m:oMath>
       </m:oMathPara>
-      <w:bookmarkEnd w:id="33"/>
+      <w:bookmarkEnd w:id="34"/>
     </w:p>
     <w:p>
       <w:pPr>
@@ -3707,7 +4802,7 @@
       <w:pPr>
         <w:pStyle w:val="BodyText"/>
       </w:pPr>
-      <w:bookmarkStart w:id="34" w:name="eq-2"/>
+      <w:bookmarkStart w:id="35" w:name="eq-2"/>
       <m:oMathPara>
         <m:oMathParaPr>
           <m:jc m:val="center"/>
@@ -3920,7 +5015,7 @@
           </m:d>
         </m:oMath>
       </m:oMathPara>
-      <w:bookmarkEnd w:id="34"/>
+      <w:bookmarkEnd w:id="35"/>
     </w:p>
     <w:p>
       <w:pPr>
@@ -4494,8 +5589,8 @@
         <w:t xml:space="preserve">.</w:t>
       </w:r>
     </w:p>
-    <w:bookmarkEnd w:id="35"/>
-    <w:bookmarkStart w:id="36" w:name="sec-comparative-rationale"/>
+    <w:bookmarkEnd w:id="36"/>
+    <w:bookmarkStart w:id="37" w:name="sec-comparative-rationale"/>
     <w:p>
       <w:pPr>
         <w:pStyle w:val="Heading2"/>
@@ -4852,8 +5947,8 @@
         <w:t xml:space="preserve">for computational tractability. Cached estimates across all four values agree to within bootstrap noise; full algebraic derivation and empirical confirmation are in the Appendix, Section D.1 (Population Size and the Invariance of Prevalence).</w:t>
       </w:r>
     </w:p>
-    <w:bookmarkEnd w:id="36"/>
-    <w:bookmarkStart w:id="37" w:name="sec-bootstrap"/>
+    <w:bookmarkEnd w:id="37"/>
+    <w:bookmarkStart w:id="38" w:name="sec-bootstrap"/>
     <w:p>
       <w:pPr>
         <w:pStyle w:val="Heading2"/>
@@ -4932,9 +6027,9 @@
         <w:t xml:space="preserve">assumptions (50K, 100K, 980K, 1.74M) and NSUM adjustment factor values. Full results are reported in the Appendix.</w:t>
       </w:r>
     </w:p>
-    <w:bookmarkEnd w:id="37"/>
     <w:bookmarkEnd w:id="38"/>
-    <w:bookmarkStart w:id="59" w:name="sec-results"/>
+    <w:bookmarkEnd w:id="39"/>
+    <w:bookmarkStart w:id="60" w:name="sec-results"/>
     <w:p>
       <w:pPr>
         <w:pStyle w:val="Heading1"/>
@@ -5079,12 +6174,12 @@
       <w:r>
         <w:t xml:space="preserve">fixed at 0.9 (</w:t>
       </w:r>
-      <w:hyperlink w:anchor="sec-estimation-framework">
+      <w:hyperlink w:anchor="sec-sensitivity">
         <w:r>
           <w:rPr>
             <w:rStyle w:val="Hyperlink"/>
           </w:rPr>
-          <w:t xml:space="preserve">Section 3.4</w:t>
+          <w:t xml:space="preserve">Section 4.5</w:t>
         </w:r>
       </w:hyperlink>
       <w:r>
@@ -5181,7 +6276,24 @@
         <w:pStyle w:val="BodyText"/>
       </w:pPr>
       <w:r>
-        <w:t xml:space="preserve">The estimates reported below are exploratory population-adjusted estimates for the RDS-reachable population of UK migrant domestic workers connected to the participating civil-society networks (primarily Kalayaan and the Latin American Women’s Rights Service). They should not be read as definitive national prevalence figures for all UK migrant domestic workers. The reported quantities in Table 3 target different population quantities (</w:t>
+        <w:t xml:space="preserve">The estimates reported below are exploratory population-adjusted estimates for the RDS-reachable population of UK migrant domestic workers connected to the participating civil-society networks (primarily Kalayaan and the Latin American Women’s Rights Service). They should not be read as definitive national prevalence figures for all UK migrant domestic workers. The reported quantities in</w:t>
+      </w:r>
+      <w:r>
+        <w:t xml:space="preserve"> </w:t>
+      </w:r>
+      <w:hyperlink w:anchor="tbl-estimands">
+        <w:r>
+          <w:rPr>
+            <w:rStyle w:val="Hyperlink"/>
+          </w:rPr>
+          <w:t xml:space="preserve">Table 4</w:t>
+        </w:r>
+      </w:hyperlink>
+      <w:r>
+        <w:t xml:space="preserve"> </w:t>
+      </w:r>
+      <w:r>
+        <w:t xml:space="preserve">target different population quantities (</w:t>
       </w:r>
       <w:hyperlink w:anchor="sec-estimation-framework">
         <w:r>
@@ -5192,12 +6304,43 @@
         </w:r>
       </w:hyperlink>
       <w:r>
-        <w:t xml:space="preserve">,</w:t>
-      </w:r>
-      <w:r>
-        <w:t xml:space="preserve"> </w:t>
-      </w:r>
-      <w:hyperlink w:anchor="tbl-estimands">
+        <w:t xml:space="preserve">), so absolute levels also differ by estimator in interpretable ways.</w:t>
+      </w:r>
+    </w:p>
+    <w:bookmarkStart w:id="46" w:name="sec-descriptive"/>
+    <w:p>
+      <w:pPr>
+        <w:pStyle w:val="Heading2"/>
+      </w:pPr>
+      <w:r>
+        <w:t xml:space="preserve">4.1 Descriptive Overview</w:t>
+      </w:r>
+    </w:p>
+    <w:p>
+      <w:pPr>
+        <w:pStyle w:val="FirstParagraph"/>
+      </w:pPr>
+      <w:r>
+        <w:t xml:space="preserve">Sample demographics are presented in</w:t>
+      </w:r>
+      <w:r>
+        <w:t xml:space="preserve"> </w:t>
+      </w:r>
+      <w:hyperlink w:anchor="tbl-demographics">
+        <w:r>
+          <w:rPr>
+            <w:rStyle w:val="Hyperlink"/>
+          </w:rPr>
+          <w:t xml:space="preserve">Table 2</w:t>
+        </w:r>
+      </w:hyperlink>
+      <w:r>
+        <w:t xml:space="preserve">; sample composition by nationality cluster and recruitment wave in</w:t>
+      </w:r>
+      <w:r>
+        <w:t xml:space="preserve"> </w:t>
+      </w:r>
+      <w:hyperlink w:anchor="tbl-sample-chars">
         <w:r>
           <w:rPr>
             <w:rStyle w:val="Hyperlink"/>
@@ -5206,41 +6349,7 @@
         </w:r>
       </w:hyperlink>
       <w:r>
-        <w:t xml:space="preserve">), so absolute levels also differ by estimator in interpretable ways.</w:t>
-      </w:r>
-    </w:p>
-    <w:bookmarkStart w:id="45" w:name="sec-descriptive"/>
-    <w:p>
-      <w:pPr>
-        <w:pStyle w:val="Heading2"/>
-      </w:pPr>
-      <w:r>
-        <w:t xml:space="preserve">4.1 Descriptive Overview</w:t>
-      </w:r>
-    </w:p>
-    <w:p>
-      <w:pPr>
-        <w:pStyle w:val="FirstParagraph"/>
-      </w:pPr>
-      <w:r>
-        <w:t xml:space="preserve">Sample characteristics are presented in</w:t>
-      </w:r>
-      <w:r>
-        <w:t xml:space="preserve"> </w:t>
-      </w:r>
-      <w:hyperlink w:anchor="tbl-sample-chars">
-        <w:r>
-          <w:rPr>
-            <w:rStyle w:val="Hyperlink"/>
-          </w:rPr>
-          <w:t xml:space="preserve">Table 2</w:t>
-        </w:r>
-      </w:hyperlink>
-      <w:r>
-        <w:t xml:space="preserve"> </w:t>
-      </w:r>
-      <w:r>
-        <w:t xml:space="preserve">and</w:t>
+        <w:t xml:space="preserve">; the recruitment network in</w:t>
       </w:r>
       <w:r>
         <w:t xml:space="preserve"> </w:t>
@@ -5254,10 +6363,10 @@
         </w:r>
       </w:hyperlink>
       <w:r>
-        <w:t xml:space="preserve">. 97 respondents completed the survey; 85 with non-zero network degree were included in RDS analysis. The analytical sample is 93% transnational migrant, 97% female, 76% Filipino, with over half aged 45+ and 45% self-employed.</w:t>
-      </w:r>
-    </w:p>
-    <w:bookmarkStart w:id="44" w:name="sec-rds-diagnostics"/>
+        <w:t xml:space="preserve">. 97 respondents completed the survey; 85 with non-zero network degree were included in RDS analysis. The analytical sample is 93% transnational migrant, 98% female, 76% Filipino, with 49% aged 45+ and 47% self-employed.</w:t>
+      </w:r>
+    </w:p>
+    <w:bookmarkStart w:id="45" w:name="sec-rds-diagnostics"/>
     <w:p>
       <w:pPr>
         <w:pStyle w:val="Heading3"/>
@@ -5281,7 +6390,7 @@
           <w:rPr>
             <w:rStyle w:val="Hyperlink"/>
           </w:rPr>
-          <w:t xml:space="preserve">Table 4</w:t>
+          <w:t xml:space="preserve">Table 5</w:t>
         </w:r>
       </w:hyperlink>
       <w:r>
@@ -5335,7 +6444,7 @@
       <w:tr>
         <w:tc>
           <w:tcPr/>
-          <w:bookmarkStart w:id="39" w:name="tbl-rds-diagnostics"/>
+          <w:bookmarkStart w:id="40" w:name="tbl-rds-diagnostics"/>
           <w:p>
             <w:pPr>
               <w:jc w:val="center"/>
@@ -5346,7 +6455,7 @@
               <w:pStyle w:val="ImageCaption"/>
             </w:pPr>
             <w:r>
-              <w:t xml:space="preserve">Table 4: RDS sampling diagnostics for the analytical sample (n = 85). Computed from the anonymised processed analysis dataset; replication code is available in the OSF repository. See</w:t>
+              <w:t xml:space="preserve">Table 5: RDS sampling diagnostics for the analytical sample (n = 85). Computed from the anonymised processed analysis dataset; replication code is available in the OSF repository. See</w:t>
             </w:r>
             <w:r>
               <w:t xml:space="preserve"> </w:t>
@@ -5395,7 +6504,7 @@
               </w:tc>
             </w:tr>
           </w:tbl>
-          <w:bookmarkEnd w:id="39"/>
+          <w:bookmarkEnd w:id="40"/>
           <w:p/>
         </w:tc>
       </w:tr>
@@ -5421,7 +6530,7 @@
       <w:tr>
         <w:tc>
           <w:tcPr/>
-          <w:bookmarkStart w:id="43" w:name="fig-rds-diagnostics"/>
+          <w:bookmarkStart w:id="44" w:name="fig-rds-diagnostics"/>
           <w:p>
             <w:pPr>
               <w:pStyle w:val="Compact"/>
@@ -5432,18 +6541,18 @@
                 <wp:inline>
                   <wp:extent cx="5334000" cy="1557645"/>
                   <wp:effectExtent b="0" l="0" r="0" t="0"/>
-                  <wp:docPr descr="" title="" id="41" name="Picture"/>
+                  <wp:docPr descr="" title="" id="42" name="Picture"/>
                   <a:graphic>
                     <a:graphicData uri="http://schemas.openxmlformats.org/drawingml/2006/picture">
                       <pic:pic>
                         <pic:nvPicPr>
-                          <pic:cNvPr descr="figures/rds_diagnostics.png" id="42" name="Picture"/>
+                          <pic:cNvPr descr="figures/rds_diagnostics.png" id="43" name="Picture"/>
                           <pic:cNvPicPr>
                             <a:picLocks noChangeArrowheads="1" noChangeAspect="1"/>
                           </pic:cNvPicPr>
                         </pic:nvPicPr>
                         <pic:blipFill>
-                          <a:blip r:embed="rId40"/>
+                          <a:blip r:embed="rId41"/>
                           <a:stretch>
                             <a:fillRect/>
                           </a:stretch>
@@ -5483,7 +6592,7 @@
               <w:t xml:space="preserve">Figure 2: RDS sampling-design diagnostics. Left: distribution of respondents by recruitment wave; majority are seeds (wave 0) with only 6 of 85 respondents reaching wave 3 or higher. Middle: distribution of recruitment-chain lengths by root seed; 30 of 46 chains are singletons (seed with no recruits), and one chain (seed #55, length 12) accounts for a disproportionate share of wave-2+ respondents. Right: distribution of reported network size (q13), showing strong right skew (median 5, mean 8.9, max 105). Source: Authors’ construction. Computed from the anonymised processed analysis dataset; replication code is available in the OSF repository.</w:t>
             </w:r>
           </w:p>
-          <w:bookmarkEnd w:id="43"/>
+          <w:bookmarkEnd w:id="44"/>
         </w:tc>
       </w:tr>
     </w:tbl>
@@ -5528,9 +6637,9 @@
         <w:t xml:space="preserve">quantifies how much the standard equilibrium assumption matters (RDS-I runs 5–15 percentage points higher, with the gap larger where seed-cluster homophily is strongest).</w:t>
       </w:r>
     </w:p>
-    <w:bookmarkEnd w:id="44"/>
     <w:bookmarkEnd w:id="45"/>
-    <w:bookmarkStart w:id="50" w:name="sec-composite-results"/>
+    <w:bookmarkEnd w:id="46"/>
+    <w:bookmarkStart w:id="51" w:name="sec-composite-results"/>
     <w:p>
       <w:pPr>
         <w:pStyle w:val="Heading2"/>
@@ -5665,7 +6774,7 @@
       <w:tr>
         <w:tc>
           <w:tcPr/>
-          <w:bookmarkStart w:id="49" w:name="fig-composite"/>
+          <w:bookmarkStart w:id="50" w:name="fig-composite"/>
           <w:p>
             <w:pPr>
               <w:pStyle w:val="Compact"/>
@@ -5676,18 +6785,18 @@
                 <wp:inline>
                   <wp:extent cx="5334000" cy="2370666"/>
                   <wp:effectExtent b="0" l="0" r="0" t="0"/>
-                  <wp:docPr descr="" title="" id="47" name="Picture"/>
+                  <wp:docPr descr="" title="" id="48" name="Picture"/>
                   <a:graphic>
                     <a:graphicData uri="http://schemas.openxmlformats.org/drawingml/2006/picture">
                       <pic:pic>
                         <pic:nvPicPr>
-                          <pic:cNvPr descr="figures/fig3_composite_risk.png" id="48" name="Picture"/>
+                          <pic:cNvPr descr="figures/fig3_composite_risk.png" id="49" name="Picture"/>
                           <pic:cNvPicPr>
                             <a:picLocks noChangeArrowheads="1" noChangeAspect="1"/>
                           </pic:cNvPicPr>
                         </pic:nvPicPr>
                         <pic:blipFill>
-                          <a:blip r:embed="rId46"/>
+                          <a:blip r:embed="rId47"/>
                           <a:stretch>
                             <a:fillRect/>
                           </a:stretch>
@@ -5727,12 +6836,12 @@
               <w:t xml:space="preserve">Figure 3: Composite Risk Index: Comparison of Three Estimators. Mean composite risk index across the observed RDS sample (descriptive; n=85), the RDS-SS adjusted estimator (Gile’s Successive Sampling with bootstrap 95% CI), and the Bayesian Model-Assisted (MA) estimator (with 95% credible interval). The wide MA credible interval reflects known limitations of model-assisted inference for continuous outcomes; the RDS-SS estimate is the more reliable population-adjusted figure. Source: Authors’ own work.</w:t>
             </w:r>
           </w:p>
-          <w:bookmarkEnd w:id="49"/>
+          <w:bookmarkEnd w:id="50"/>
         </w:tc>
       </w:tr>
     </w:tbl>
-    <w:bookmarkEnd w:id="50"/>
-    <w:bookmarkStart w:id="56" w:name="sec-binary-results"/>
+    <w:bookmarkEnd w:id="51"/>
+    <w:bookmarkStart w:id="57" w:name="sec-binary-results"/>
     <w:p>
       <w:pPr>
         <w:pStyle w:val="Heading2"/>
@@ -5750,7 +6859,7 @@
           <w:rPr>
             <w:rStyle w:val="Hyperlink"/>
           </w:rPr>
-          <w:t xml:space="preserve">Table 5</w:t>
+          <w:t xml:space="preserve">Table 6</w:t>
         </w:r>
       </w:hyperlink>
       <w:r>
@@ -5813,7 +6922,7 @@
       <w:tr>
         <w:tc>
           <w:tcPr/>
-          <w:bookmarkStart w:id="51" w:name="tbl-preferred-estimates"/>
+          <w:bookmarkStart w:id="52" w:name="tbl-preferred-estimates"/>
           <w:p>
             <w:pPr>
               <w:jc w:val="center"/>
@@ -5824,7 +6933,7 @@
               <w:pStyle w:val="ImageCaption"/>
             </w:pPr>
             <w:r>
-              <w:t xml:space="preserve">Table 5: Preferred prevalence estimates for the five binary ILO-aligned indicators (UK migrant domestic workers connected to participating civil-society networks;</w:t>
+              <w:t xml:space="preserve">Table 6: Preferred prevalence estimates for the five binary ILO-aligned indicators (UK migrant domestic workers connected to participating civil-society networks;</w:t>
             </w:r>
             <w:r>
               <w:t xml:space="preserve"> </w:t>
@@ -6136,7 +7245,7 @@
               </w:tc>
             </w:tr>
           </w:tbl>
-          <w:bookmarkEnd w:id="51"/>
+          <w:bookmarkEnd w:id="52"/>
           <w:p/>
         </w:tc>
       </w:tr>
@@ -6162,7 +7271,7 @@
       <w:tr>
         <w:tc>
           <w:tcPr/>
-          <w:bookmarkStart w:id="55" w:name="fig-ma-binary"/>
+          <w:bookmarkStart w:id="56" w:name="fig-ma-binary"/>
           <w:p>
             <w:pPr>
               <w:pStyle w:val="Compact"/>
@@ -6173,18 +7282,18 @@
                 <wp:inline>
                   <wp:extent cx="5334000" cy="3333750"/>
                   <wp:effectExtent b="0" l="0" r="0" t="0"/>
-                  <wp:docPr descr="" title="" id="53" name="Picture"/>
+                  <wp:docPr descr="" title="" id="54" name="Picture"/>
                   <a:graphic>
                     <a:graphicData uri="http://schemas.openxmlformats.org/drawingml/2006/picture">
                       <pic:pic>
                         <pic:nvPicPr>
-                          <pic:cNvPr descr="figures/fig4_ma_binary.png" id="54" name="Picture"/>
+                          <pic:cNvPr descr="figures/fig4_ma_binary.png" id="55" name="Picture"/>
                           <pic:cNvPicPr>
                             <a:picLocks noChangeArrowheads="1" noChangeAspect="1"/>
                           </pic:cNvPicPr>
                         </pic:nvPicPr>
                         <pic:blipFill>
-                          <a:blip r:embed="rId52"/>
+                          <a:blip r:embed="rId53"/>
                           <a:stretch>
                             <a:fillRect/>
                           </a:stretch>
@@ -6242,12 +7351,12 @@
               <w:t xml:space="preserve">. Source: Authors’ own work.</w:t>
             </w:r>
           </w:p>
-          <w:bookmarkEnd w:id="55"/>
+          <w:bookmarkEnd w:id="56"/>
         </w:tc>
       </w:tr>
     </w:tbl>
-    <w:bookmarkEnd w:id="56"/>
-    <w:bookmarkStart w:id="57" w:name="sec-supporting-estimates"/>
+    <w:bookmarkEnd w:id="57"/>
+    <w:bookmarkStart w:id="58" w:name="sec-supporting-estimates"/>
     <w:p>
       <w:pPr>
         <w:pStyle w:val="Heading2"/>
@@ -6261,7 +7370,21 @@
         <w:pStyle w:val="FirstParagraph"/>
       </w:pPr>
       <w:r>
-        <w:t xml:space="preserve">Three additional families of estimates are reported in full in the Appendix (Section D) for transparency and robustness: (a) The five Bayesian Model-Assisted (MA-RDS) posterior means (Appendix Table D.1) range from 34.1% for document withholding to 84.0% for excessive working hours, reproducing the RDS-SS ordering in Table 5. (b) Direct comparison of RDS-I and RDS-SS estimators for each indicator with per-method bootstrap 95% CIs (Appendix Table D.3); RDS-I runs systematically higher than RDS-SS by 5–15 percentage points, consistent with the standard finding that RDS-I is sensitive to seed dependence and performs poorly at the small sample sizes and shallow chain depths characteristic of our design (</w:t>
+        <w:t xml:space="preserve">Three additional families of estimates are reported in full in the Appendix (Section D) for transparency and robustness: (a) The five Bayesian Model-Assisted (MA-RDS) posterior means (Appendix Table D.1) range from 34.1% for document withholding to 84.0% for excessive working hours, reproducing the RDS-SS ordering in</w:t>
+      </w:r>
+      <w:r>
+        <w:t xml:space="preserve"> </w:t>
+      </w:r>
+      <w:hyperlink w:anchor="tbl-preferred-estimates">
+        <w:r>
+          <w:rPr>
+            <w:rStyle w:val="Hyperlink"/>
+          </w:rPr>
+          <w:t xml:space="preserve">Table 6</w:t>
+        </w:r>
+      </w:hyperlink>
+      <w:r>
+        <w:t xml:space="preserve">. (b) Direct comparison of RDS-I and RDS-SS estimators for each indicator with per-method bootstrap 95% CIs (Appendix Table D.3); RDS-I runs systematically higher than RDS-SS by 5–15 percentage points, consistent with the standard finding that RDS-I is sensitive to seed dependence and performs poorly at the small sample sizes and shallow chain depths characteristic of our design (</w:t>
       </w:r>
       <w:hyperlink w:anchor="sec-rds-diagnostics">
         <w:r>
@@ -6300,8 +7423,8 @@
         <w:t xml:space="preserve">.</w:t>
       </w:r>
     </w:p>
-    <w:bookmarkEnd w:id="57"/>
-    <w:bookmarkStart w:id="58" w:name="sec-sensitivity"/>
+    <w:bookmarkEnd w:id="58"/>
+    <w:bookmarkStart w:id="59" w:name="sec-sensitivity"/>
     <w:p>
       <w:pPr>
         <w:pStyle w:val="Heading2"/>
@@ -6450,9 +7573,9 @@
         <w:t xml:space="preserve">the substantive picture – which exploitation behaviours are most common, which least – does not.</w:t>
       </w:r>
     </w:p>
-    <w:bookmarkEnd w:id="58"/>
     <w:bookmarkEnd w:id="59"/>
-    <w:bookmarkStart w:id="66" w:name="sec-discussion"/>
+    <w:bookmarkEnd w:id="60"/>
+    <w:bookmarkStart w:id="67" w:name="sec-discussion"/>
     <w:p>
       <w:pPr>
         <w:pStyle w:val="Heading1"/>
@@ -6461,7 +7584,7 @@
         <w:t xml:space="preserve">5. Discussion</w:t>
       </w:r>
     </w:p>
-    <w:bookmarkStart w:id="60" w:name="sec-summary"/>
+    <w:bookmarkStart w:id="61" w:name="sec-summary"/>
     <w:p>
       <w:pPr>
         <w:pStyle w:val="Heading2"/>
@@ -6508,8 +7631,8 @@
         <w:t xml:space="preserve">finding of the paper. The remainder of this section interprets both the absolute estimates and the inter-method divergence.</w:t>
       </w:r>
     </w:p>
-    <w:bookmarkEnd w:id="60"/>
-    <w:bookmarkStart w:id="61" w:name="sec-contributions"/>
+    <w:bookmarkEnd w:id="61"/>
+    <w:bookmarkStart w:id="62" w:name="sec-contributions"/>
     <w:p>
       <w:pPr>
         <w:pStyle w:val="Heading2"/>
@@ -6544,7 +7667,7 @@
           <w:rPr>
             <w:rStyle w:val="Hyperlink"/>
           </w:rPr>
-          <w:t xml:space="preserve">Table 3</w:t>
+          <w:t xml:space="preserve">Table 4</w:t>
         </w:r>
       </w:hyperlink>
       <w:r>
@@ -6704,8 +7827,8 @@
         <w:t xml:space="preserve">).</w:t>
       </w:r>
     </w:p>
-    <w:bookmarkEnd w:id="61"/>
-    <w:bookmarkStart w:id="62" w:name="sec-divergence"/>
+    <w:bookmarkEnd w:id="62"/>
+    <w:bookmarkStart w:id="63" w:name="sec-divergence"/>
     <w:p>
       <w:pPr>
         <w:pStyle w:val="Heading2"/>
@@ -6843,7 +7966,7 @@
           <w:rPr>
             <w:rStyle w:val="Hyperlink"/>
           </w:rPr>
-          <w:t xml:space="preserve">Table 3</w:t>
+          <w:t xml:space="preserve">Table 4</w:t>
         </w:r>
       </w:hyperlink>
       <w:r>
@@ -6879,7 +8002,7 @@
           <w:rPr>
             <w:rStyle w:val="Hyperlink"/>
           </w:rPr>
-          <w:t xml:space="preserve">Table 5</w:t>
+          <w:t xml:space="preserve">Table 6</w:t>
         </w:r>
       </w:hyperlink>
       <w:r>
@@ -6984,8 +8107,8 @@
         <w:t xml:space="preserve">); a longer field period would help in future replications.</w:t>
       </w:r>
     </w:p>
-    <w:bookmarkEnd w:id="62"/>
-    <w:bookmarkStart w:id="63" w:name="sec-generalisability"/>
+    <w:bookmarkEnd w:id="63"/>
+    <w:bookmarkStart w:id="64" w:name="sec-generalisability"/>
     <w:p>
       <w:pPr>
         <w:pStyle w:val="Heading2"/>
@@ -7077,7 +8200,7 @@
           <w:rPr>
             <w:rStyle w:val="Hyperlink"/>
           </w:rPr>
-          <w:t xml:space="preserve">Table 3</w:t>
+          <w:t xml:space="preserve">Table 4</w:t>
         </w:r>
       </w:hyperlink>
       <w:r>
@@ -7179,8 +8302,8 @@
         <w:t xml:space="preserve">).</w:t>
       </w:r>
     </w:p>
-    <w:bookmarkEnd w:id="63"/>
-    <w:bookmarkStart w:id="64" w:name="sec-weights-sensitivity"/>
+    <w:bookmarkEnd w:id="64"/>
+    <w:bookmarkStart w:id="65" w:name="sec-weights-sensitivity"/>
     <w:p>
       <w:pPr>
         <w:pStyle w:val="Heading2"/>
@@ -7356,8 +8479,8 @@
         <w:t xml:space="preserve">– do not depend on the specific weighting choice within any plausible alternative parameterisation. Full perturbation results are reported in the Appendix.</w:t>
       </w:r>
     </w:p>
-    <w:bookmarkEnd w:id="64"/>
-    <w:bookmarkStart w:id="65" w:name="sec-policy"/>
+    <w:bookmarkEnd w:id="65"/>
+    <w:bookmarkStart w:id="66" w:name="sec-policy"/>
     <w:p>
       <w:pPr>
         <w:pStyle w:val="Heading2"/>
@@ -7402,9 +8525,9 @@
         <w:t xml:space="preserve">Future work should extend the methodology to web-RDS at scale and integrate with administrative data sources (NRM referrals, immigration enforcement data subject to firewall safeguards, employment-tribunal records) for triangulation against complementary data streams.</w:t>
       </w:r>
     </w:p>
-    <w:bookmarkEnd w:id="65"/>
     <w:bookmarkEnd w:id="66"/>
-    <w:bookmarkStart w:id="67" w:name="sec-conclusion"/>
+    <w:bookmarkEnd w:id="67"/>
+    <w:bookmarkStart w:id="68" w:name="sec-conclusion"/>
     <w:p>
       <w:pPr>
         <w:pStyle w:val="Heading1"/>
@@ -7468,8 +8591,8 @@
         <w:t xml:space="preserve">The dual-method design demonstrated here is replicable. The matched ego-alter survey instrument, parallel RDS and NSUM estimation framework, and explicit visibility-adjustment sensitivity reporting can be applied to other hidden populations relevant to SDG Target 8.7 monitoring — undocumented agricultural workers, sex workers, kafala-system migrants — and any population for which official statistics are silent.</w:t>
       </w:r>
     </w:p>
-    <w:bookmarkEnd w:id="67"/>
-    <w:bookmarkStart w:id="69" w:name="sec-declarations"/>
+    <w:bookmarkEnd w:id="68"/>
+    <w:bookmarkStart w:id="70" w:name="sec-declarations"/>
     <w:p>
       <w:pPr>
         <w:pStyle w:val="Heading1"/>
@@ -7552,7 +8675,7 @@
       <w:r>
         <w:t xml:space="preserve"> </w:t>
       </w:r>
-      <w:hyperlink r:id="rId68">
+      <w:hyperlink r:id="rId69">
         <w:r>
           <w:rPr>
             <w:rStyle w:val="Hyperlink"/>
@@ -7600,8 +8723,8 @@
         <w:t xml:space="preserve">CE designed and collected data; SM performed analysis. Both contributed to the writing of the document.</w:t>
       </w:r>
     </w:p>
-    <w:bookmarkEnd w:id="69"/>
-    <w:bookmarkStart w:id="119" w:name="references"/>
+    <w:bookmarkEnd w:id="70"/>
+    <w:bookmarkStart w:id="120" w:name="references"/>
     <w:p>
       <w:pPr>
         <w:pStyle w:val="Heading1"/>
@@ -7610,8 +8733,8 @@
         <w:t xml:space="preserve">References</w:t>
       </w:r>
     </w:p>
-    <w:bookmarkStart w:id="118" w:name="refs"/>
-    <w:bookmarkStart w:id="70" w:name="ref-bern09-broken"/>
+    <w:bookmarkStart w:id="119" w:name="refs"/>
+    <w:bookmarkStart w:id="71" w:name="ref-bern09-broken"/>
     <w:p>
       <w:pPr>
         <w:pStyle w:val="Bibliography"/>
@@ -7664,8 +8787,8 @@
         <w:t xml:space="preserve">[UCLA IRLE Report.].</w:t>
       </w:r>
     </w:p>
-    <w:bookmarkEnd w:id="70"/>
-    <w:bookmarkStart w:id="71" w:name="ref-feeh16-generalizing"/>
+    <w:bookmarkEnd w:id="71"/>
+    <w:bookmarkStart w:id="72" w:name="ref-feeh16-generalizing"/>
     <w:p>
       <w:pPr>
         <w:pStyle w:val="Bibliography"/>
@@ -7742,8 +8865,8 @@
         <w:t xml:space="preserve">(1), 153–186.</w:t>
       </w:r>
     </w:p>
-    <w:bookmarkEnd w:id="71"/>
-    <w:bookmarkStart w:id="73" w:name="ref-gile11-improved"/>
+    <w:bookmarkEnd w:id="72"/>
+    <w:bookmarkStart w:id="74" w:name="ref-gile11-improved"/>
     <w:p>
       <w:pPr>
         <w:pStyle w:val="Bibliography"/>
@@ -7813,7 +8936,7 @@
       <w:r>
         <w:t xml:space="preserve"> </w:t>
       </w:r>
-      <w:hyperlink r:id="rId72">
+      <w:hyperlink r:id="rId73">
         <w:r>
           <w:rPr>
             <w:rStyle w:val="Hyperlink"/>
@@ -7822,8 +8945,8 @@
         </w:r>
       </w:hyperlink>
     </w:p>
-    <w:bookmarkEnd w:id="73"/>
-    <w:bookmarkStart w:id="75" w:name="ref-gile18-methods"/>
+    <w:bookmarkEnd w:id="74"/>
+    <w:bookmarkStart w:id="76" w:name="ref-gile18-methods"/>
     <w:p>
       <w:pPr>
         <w:pStyle w:val="Bibliography"/>
@@ -7860,7 +8983,7 @@
       <w:r>
         <w:t xml:space="preserve"> </w:t>
       </w:r>
-      <w:hyperlink r:id="rId74">
+      <w:hyperlink r:id="rId75">
         <w:r>
           <w:rPr>
             <w:rStyle w:val="Hyperlink"/>
@@ -7869,8 +8992,8 @@
         </w:r>
       </w:hyperlink>
     </w:p>
-    <w:bookmarkEnd w:id="75"/>
-    <w:bookmarkStart w:id="76" w:name="ref-gile10-respondentdriven"/>
+    <w:bookmarkEnd w:id="76"/>
+    <w:bookmarkStart w:id="77" w:name="ref-gile10-respondentdriven"/>
     <w:p>
       <w:pPr>
         <w:pStyle w:val="Bibliography"/>
@@ -7932,8 +9055,8 @@
         <w:t xml:space="preserve">, 285–327.</w:t>
       </w:r>
     </w:p>
-    <w:bookmarkEnd w:id="76"/>
-    <w:bookmarkStart w:id="78" w:name="ref-gile15-network"/>
+    <w:bookmarkEnd w:id="77"/>
+    <w:bookmarkStart w:id="79" w:name="ref-gile15-network"/>
     <w:p>
       <w:pPr>
         <w:pStyle w:val="Bibliography"/>
@@ -7970,7 +9093,7 @@
       <w:r>
         <w:t xml:space="preserve"> </w:t>
       </w:r>
-      <w:hyperlink r:id="rId77">
+      <w:hyperlink r:id="rId78">
         <w:r>
           <w:rPr>
             <w:rStyle w:val="Hyperlink"/>
@@ -7979,8 +9102,8 @@
         </w:r>
       </w:hyperlink>
     </w:p>
-    <w:bookmarkEnd w:id="78"/>
-    <w:bookmarkStart w:id="80" w:name="ref-goel10-assessing"/>
+    <w:bookmarkEnd w:id="79"/>
+    <w:bookmarkStart w:id="81" w:name="ref-goel10-assessing"/>
     <w:p>
       <w:pPr>
         <w:pStyle w:val="Bibliography"/>
@@ -8017,7 +9140,7 @@
       <w:r>
         <w:t xml:space="preserve"> </w:t>
       </w:r>
-      <w:hyperlink r:id="rId79">
+      <w:hyperlink r:id="rId80">
         <w:r>
           <w:rPr>
             <w:rStyle w:val="Hyperlink"/>
@@ -8026,8 +9149,8 @@
         </w:r>
       </w:hyperlink>
     </w:p>
-    <w:bookmarkEnd w:id="80"/>
-    <w:bookmarkStart w:id="82" w:name="ref-hand14-estimating"/>
+    <w:bookmarkEnd w:id="81"/>
+    <w:bookmarkStart w:id="83" w:name="ref-hand14-estimating"/>
     <w:p>
       <w:pPr>
         <w:pStyle w:val="Bibliography"/>
@@ -8076,7 +9199,7 @@
       <w:r>
         <w:t xml:space="preserve"> </w:t>
       </w:r>
-      <w:hyperlink r:id="rId81">
+      <w:hyperlink r:id="rId82">
         <w:r>
           <w:rPr>
             <w:rStyle w:val="Hyperlink"/>
@@ -8085,8 +9208,8 @@
         </w:r>
       </w:hyperlink>
     </w:p>
-    <w:bookmarkEnd w:id="82"/>
-    <w:bookmarkStart w:id="84" w:name="ref-heck97-respondentdriven"/>
+    <w:bookmarkEnd w:id="83"/>
+    <w:bookmarkStart w:id="85" w:name="ref-heck97-respondentdriven"/>
     <w:p>
       <w:pPr>
         <w:pStyle w:val="Bibliography"/>
@@ -8135,7 +9258,7 @@
       <w:r>
         <w:t xml:space="preserve"> </w:t>
       </w:r>
-      <w:hyperlink r:id="rId83">
+      <w:hyperlink r:id="rId84">
         <w:r>
           <w:rPr>
             <w:rStyle w:val="Hyperlink"/>
@@ -8144,8 +9267,8 @@
         </w:r>
       </w:hyperlink>
     </w:p>
-    <w:bookmarkEnd w:id="84"/>
-    <w:bookmarkStart w:id="85" w:name="ref-heck11-comment"/>
+    <w:bookmarkEnd w:id="85"/>
+    <w:bookmarkStart w:id="86" w:name="ref-heck11-comment"/>
     <w:p>
       <w:pPr>
         <w:pStyle w:val="Bibliography"/>
@@ -8192,8 +9315,8 @@
         <w:t xml:space="preserve">(1), 355–366.</w:t>
       </w:r>
     </w:p>
-    <w:bookmarkEnd w:id="85"/>
-    <w:bookmarkStart w:id="86" w:name="ref-hick25-human"/>
+    <w:bookmarkEnd w:id="86"/>
+    <w:bookmarkStart w:id="87" w:name="ref-hick25-human"/>
     <w:p>
       <w:pPr>
         <w:pStyle w:val="Bibliography"/>
@@ -8232,8 +9355,8 @@
         <w:t xml:space="preserve">(This Project Was Supported by Cooperative Agreement No. 2019-85 CX-K002 NCJ 309951). Bureau of Justice Statistics.</w:t>
       </w:r>
     </w:p>
-    <w:bookmarkEnd w:id="86"/>
-    <w:bookmarkStart w:id="88" w:name="ref-ILO11-indicators"/>
+    <w:bookmarkEnd w:id="87"/>
+    <w:bookmarkStart w:id="89" w:name="ref-ILO11-indicators"/>
     <w:p>
       <w:pPr>
         <w:pStyle w:val="Bibliography"/>
@@ -8257,7 +9380,7 @@
       <w:r>
         <w:t xml:space="preserve"> </w:t>
       </w:r>
-      <w:hyperlink r:id="rId87">
+      <w:hyperlink r:id="rId88">
         <w:r>
           <w:rPr>
             <w:rStyle w:val="Hyperlink"/>
@@ -8266,8 +9389,8 @@
         </w:r>
       </w:hyperlink>
     </w:p>
-    <w:bookmarkEnd w:id="88"/>
-    <w:bookmarkStart w:id="90" w:name="ref-hard24-ilo"/>
+    <w:bookmarkEnd w:id="89"/>
+    <w:bookmarkStart w:id="91" w:name="ref-hard24-ilo"/>
     <w:p>
       <w:pPr>
         <w:pStyle w:val="Bibliography"/>
@@ -8294,7 +9417,7 @@
       <w:r>
         <w:t xml:space="preserve"> </w:t>
       </w:r>
-      <w:hyperlink r:id="rId89">
+      <w:hyperlink r:id="rId90">
         <w:r>
           <w:rPr>
             <w:rStyle w:val="Hyperlink"/>
@@ -8303,8 +9426,8 @@
         </w:r>
       </w:hyperlink>
     </w:p>
-    <w:bookmarkEnd w:id="90"/>
-    <w:bookmarkStart w:id="91" w:name="ref-int25-ilo"/>
+    <w:bookmarkEnd w:id="91"/>
+    <w:bookmarkStart w:id="92" w:name="ref-int25-ilo"/>
     <w:p>
       <w:pPr>
         <w:pStyle w:val="Bibliography"/>
@@ -8331,7 +9454,7 @@
       <w:r>
         <w:t xml:space="preserve"> </w:t>
       </w:r>
-      <w:hyperlink r:id="rId89">
+      <w:hyperlink r:id="rId90">
         <w:r>
           <w:rPr>
             <w:rStyle w:val="Hyperlink"/>
@@ -8340,8 +9463,8 @@
         </w:r>
       </w:hyperlink>
     </w:p>
-    <w:bookmarkEnd w:id="91"/>
-    <w:bookmarkStart w:id="92" w:name="ref-ist20-prevalence"/>
+    <w:bookmarkEnd w:id="92"/>
+    <w:bookmarkStart w:id="93" w:name="ref-ist20-prevalence"/>
     <w:p>
       <w:pPr>
         <w:pStyle w:val="Bibliography"/>
@@ -8401,8 +9524,8 @@
         <w:t xml:space="preserve">[Technical Report]. Global Fund to End Modern Slavery.</w:t>
       </w:r>
     </w:p>
-    <w:bookmarkEnd w:id="92"/>
-    <w:bookmarkStart w:id="93" w:name="ref-jord20-overcoming"/>
+    <w:bookmarkEnd w:id="93"/>
+    <w:bookmarkStart w:id="94" w:name="ref-jord20-overcoming"/>
     <w:p>
       <w:pPr>
         <w:pStyle w:val="Bibliography"/>
@@ -8437,8 +9560,8 @@
         <w:t xml:space="preserve">(3), 371–385.</w:t>
       </w:r>
     </w:p>
-    <w:bookmarkEnd w:id="93"/>
-    <w:bookmarkStart w:id="94" w:name="ref-kala08-new"/>
+    <w:bookmarkEnd w:id="94"/>
+    <w:bookmarkStart w:id="95" w:name="ref-kala08-new"/>
     <w:p>
       <w:pPr>
         <w:pStyle w:val="Bibliography"/>
@@ -8457,8 +9580,8 @@
         <w:t xml:space="preserve">The new bonded labour?</w:t>
       </w:r>
     </w:p>
-    <w:bookmarkEnd w:id="94"/>
-    <w:bookmarkStart w:id="96" w:name="ref-kill98-social"/>
+    <w:bookmarkEnd w:id="95"/>
+    <w:bookmarkStart w:id="97" w:name="ref-kill98-social"/>
     <w:p>
       <w:pPr>
         <w:pStyle w:val="Bibliography"/>
@@ -8504,7 +9627,7 @@
       <w:r>
         <w:t xml:space="preserve"> </w:t>
       </w:r>
-      <w:hyperlink r:id="rId95">
+      <w:hyperlink r:id="rId96">
         <w:r>
           <w:rPr>
             <w:rStyle w:val="Hyperlink"/>
@@ -8513,8 +9636,8 @@
         </w:r>
       </w:hyperlink>
     </w:p>
-    <w:bookmarkEnd w:id="96"/>
-    <w:bookmarkStart w:id="98" w:name="ref-malt15-estimating"/>
+    <w:bookmarkEnd w:id="97"/>
+    <w:bookmarkStart w:id="99" w:name="ref-malt15-estimating"/>
     <w:p>
       <w:pPr>
         <w:pStyle w:val="Bibliography"/>
@@ -8551,7 +9674,7 @@
       <w:r>
         <w:t xml:space="preserve"> </w:t>
       </w:r>
-      <w:hyperlink r:id="rId97">
+      <w:hyperlink r:id="rId98">
         <w:r>
           <w:rPr>
             <w:rStyle w:val="Hyperlink"/>
@@ -8560,8 +9683,8 @@
         </w:r>
       </w:hyperlink>
     </w:p>
-    <w:bookmarkEnd w:id="98"/>
-    <w:bookmarkStart w:id="99" w:name="ref-mant16-modern"/>
+    <w:bookmarkEnd w:id="99"/>
+    <w:bookmarkStart w:id="100" w:name="ref-mant16-modern"/>
     <w:p>
       <w:pPr>
         <w:pStyle w:val="Bibliography"/>
@@ -8609,8 +9732,8 @@
         <w:t xml:space="preserve">.</w:t>
       </w:r>
     </w:p>
-    <w:bookmarkEnd w:id="99"/>
-    <w:bookmarkStart w:id="101" w:name="ref-mccr12-evaluation"/>
+    <w:bookmarkEnd w:id="100"/>
+    <w:bookmarkStart w:id="102" w:name="ref-mccr12-evaluation"/>
     <w:p>
       <w:pPr>
         <w:pStyle w:val="Bibliography"/>
@@ -8647,7 +9770,7 @@
       <w:r>
         <w:t xml:space="preserve"> </w:t>
       </w:r>
-      <w:hyperlink r:id="rId100">
+      <w:hyperlink r:id="rId101">
         <w:r>
           <w:rPr>
             <w:rStyle w:val="Hyperlink"/>
@@ -8656,8 +9779,8 @@
         </w:r>
       </w:hyperlink>
     </w:p>
-    <w:bookmarkEnd w:id="101"/>
-    <w:bookmarkStart w:id="103" w:name="ref-romero_blueprint_2025"/>
+    <w:bookmarkEnd w:id="102"/>
+    <w:bookmarkStart w:id="104" w:name="ref-romero_blueprint_2025"/>
     <w:p>
       <w:pPr>
         <w:pStyle w:val="Bibliography"/>
@@ -8681,7 +9804,7 @@
       <w:r>
         <w:t xml:space="preserve"> </w:t>
       </w:r>
-      <w:hyperlink r:id="rId102">
+      <w:hyperlink r:id="rId103">
         <w:r>
           <w:rPr>
             <w:rStyle w:val="Hyperlink"/>
@@ -8690,8 +9813,8 @@
         </w:r>
       </w:hyperlink>
     </w:p>
-    <w:bookmarkEnd w:id="103"/>
-    <w:bookmarkStart w:id="104" w:name="ref-salg04-sampling"/>
+    <w:bookmarkEnd w:id="104"/>
+    <w:bookmarkStart w:id="105" w:name="ref-salg04-sampling"/>
     <w:p>
       <w:pPr>
         <w:pStyle w:val="Bibliography"/>
@@ -8747,8 +9870,8 @@
         <w:t xml:space="preserve">, 193–239.</w:t>
       </w:r>
     </w:p>
-    <w:bookmarkEnd w:id="104"/>
-    <w:bookmarkStart w:id="105" w:name="ref-schw12-prevalence"/>
+    <w:bookmarkEnd w:id="105"/>
+    <w:bookmarkStart w:id="106" w:name="ref-schw12-prevalence"/>
     <w:p>
       <w:pPr>
         <w:pStyle w:val="Bibliography"/>
@@ -8792,8 +9915,8 @@
         <w:t xml:space="preserve">, 68–76.</w:t>
       </w:r>
     </w:p>
-    <w:bookmarkEnd w:id="105"/>
-    <w:bookmarkStart w:id="106" w:name="ref-serv23-closed"/>
+    <w:bookmarkEnd w:id="106"/>
+    <w:bookmarkStart w:id="107" w:name="ref-serv23-closed"/>
     <w:p>
       <w:pPr>
         <w:pStyle w:val="Bibliography"/>
@@ -8885,8 +10008,8 @@
         <w:t xml:space="preserve">.</w:t>
       </w:r>
     </w:p>
-    <w:bookmarkEnd w:id="106"/>
-    <w:bookmarkStart w:id="107" w:name="ref-thompson_new_2020"/>
+    <w:bookmarkEnd w:id="107"/>
+    <w:bookmarkStart w:id="108" w:name="ref-thompson_new_2020"/>
     <w:p>
       <w:pPr>
         <w:pStyle w:val="Bibliography"/>
@@ -8908,8 +10031,8 @@
         <w:t xml:space="preserve">.</w:t>
       </w:r>
     </w:p>
-    <w:bookmarkEnd w:id="107"/>
-    <w:bookmarkStart w:id="109" w:name="ref-vinc17-estimating"/>
+    <w:bookmarkEnd w:id="108"/>
+    <w:bookmarkStart w:id="110" w:name="ref-vinc17-estimating"/>
     <w:p>
       <w:pPr>
         <w:pStyle w:val="Bibliography"/>
@@ -8946,7 +10069,7 @@
       <w:r>
         <w:t xml:space="preserve"> </w:t>
       </w:r>
-      <w:hyperlink r:id="rId108">
+      <w:hyperlink r:id="rId109">
         <w:r>
           <w:rPr>
             <w:rStyle w:val="Hyperlink"/>
@@ -8955,8 +10078,8 @@
         </w:r>
       </w:hyperlink>
     </w:p>
-    <w:bookmarkEnd w:id="109"/>
-    <w:bookmarkStart w:id="110" w:name="ref-volz08-probability"/>
+    <w:bookmarkEnd w:id="110"/>
+    <w:bookmarkStart w:id="111" w:name="ref-volz08-probability"/>
     <w:p>
       <w:pPr>
         <w:pStyle w:val="Bibliography"/>
@@ -9012,8 +10135,8 @@
         <w:t xml:space="preserve">(1), 79.</w:t>
       </w:r>
     </w:p>
-    <w:bookmarkEnd w:id="110"/>
-    <w:bookmarkStart w:id="111" w:name="ref-wejn08-webbased"/>
+    <w:bookmarkEnd w:id="111"/>
+    <w:bookmarkStart w:id="112" w:name="ref-wejn08-webbased"/>
     <w:p>
       <w:pPr>
         <w:pStyle w:val="Bibliography"/>
@@ -9048,8 +10171,8 @@
         <w:t xml:space="preserve">(1), 105–134.</w:t>
       </w:r>
     </w:p>
-    <w:bookmarkEnd w:id="111"/>
-    <w:bookmarkStart w:id="113" w:name="ref-yauc22-neighborhood"/>
+    <w:bookmarkEnd w:id="112"/>
+    <w:bookmarkStart w:id="114" w:name="ref-yauc22-neighborhood"/>
     <w:p>
       <w:pPr>
         <w:pStyle w:val="Bibliography"/>
@@ -9107,7 +10230,7 @@
       <w:r>
         <w:t xml:space="preserve"> </w:t>
       </w:r>
-      <w:hyperlink r:id="rId112">
+      <w:hyperlink r:id="rId113">
         <w:r>
           <w:rPr>
             <w:rStyle w:val="Hyperlink"/>
@@ -9116,8 +10239,8 @@
         </w:r>
       </w:hyperlink>
     </w:p>
-    <w:bookmarkEnd w:id="113"/>
-    <w:bookmarkStart w:id="114" w:name="ref-yilm23-exploring"/>
+    <w:bookmarkEnd w:id="114"/>
+    <w:bookmarkStart w:id="115" w:name="ref-yilm23-exploring"/>
     <w:p>
       <w:pPr>
         <w:pStyle w:val="Bibliography"/>
@@ -9148,8 +10271,8 @@
         <w:t xml:space="preserve">.</w:t>
       </w:r>
     </w:p>
-    <w:bookmarkEnd w:id="114"/>
-    <w:bookmarkStart w:id="116" w:name="ref-zhang_measuring_2012"/>
+    <w:bookmarkEnd w:id="115"/>
+    <w:bookmarkStart w:id="117" w:name="ref-zhang_measuring_2012"/>
     <w:p>
       <w:pPr>
         <w:pStyle w:val="Bibliography"/>
@@ -9186,7 +10309,7 @@
       <w:r>
         <w:t xml:space="preserve"> </w:t>
       </w:r>
-      <w:hyperlink r:id="rId115">
+      <w:hyperlink r:id="rId116">
         <w:r>
           <w:rPr>
             <w:rStyle w:val="Hyperlink"/>
@@ -9195,8 +10318,8 @@
         </w:r>
       </w:hyperlink>
     </w:p>
-    <w:bookmarkEnd w:id="116"/>
-    <w:bookmarkStart w:id="117" w:name="ref-zhan19-victims"/>
+    <w:bookmarkEnd w:id="117"/>
+    <w:bookmarkStart w:id="118" w:name="ref-zhan19-victims"/>
     <w:p>
       <w:pPr>
         <w:pStyle w:val="Bibliography"/>
@@ -9264,9 +10387,9 @@
         <w:t xml:space="preserve">(7), 832–858.</w:t>
       </w:r>
     </w:p>
-    <w:bookmarkEnd w:id="117"/>
     <w:bookmarkEnd w:id="118"/>
     <w:bookmarkEnd w:id="119"/>
+    <w:bookmarkEnd w:id="120"/>
     <w:sectPr>
       <w:footnotePr>
         <w:numRestart w:val="eachSect"/>

</xml_diff>